<commit_message>
Add citation information to documentation
</commit_message>
<xml_diff>
--- a/docs/chewR_tutorial.docx
+++ b/docs/chewR_tutorial.docx
@@ -1649,6 +1649,191 @@
           <w:color w:val="EE0000"/>
         </w:rPr>
         <w:t>We suggest using the transformed variable when reporting data in abstracts, conferences, manuscripts, etc.</w:t>
+      </w:r>
+    </w:p>
+    <w:p>
+      <w:pPr>
+        <w:rPr>
+          <w:b/>
+          <w:bCs/>
+          <w:color w:val="EE0000"/>
+        </w:rPr>
+      </w:pPr>
+    </w:p>
+    <w:p>
+      <w:pPr>
+        <w:rPr>
+          <w:b/>
+          <w:bCs/>
+          <w:color w:val="EE0000"/>
+        </w:rPr>
+      </w:pPr>
+    </w:p>
+    <w:p>
+      <w:pPr>
+        <w:rPr>
+          <w:b/>
+          <w:bCs/>
+          <w:color w:val="EE0000"/>
+        </w:rPr>
+      </w:pPr>
+    </w:p>
+    <w:p>
+      <w:pPr>
+        <w:rPr>
+          <w:b/>
+          <w:bCs/>
+          <w:color w:val="EE0000"/>
+        </w:rPr>
+      </w:pPr>
+    </w:p>
+    <w:p>
+      <w:pPr>
+        <w:pStyle w:val="Heading1"/>
+      </w:pPr>
+      <w:r>
+        <w:lastRenderedPageBreak/>
+        <w:t>9</w:t>
+      </w:r>
+      <w:r>
+        <w:t xml:space="preserve">. </w:t>
+      </w:r>
+      <w:r>
+        <w:t xml:space="preserve">How to cite </w:t>
+      </w:r>
+      <w:proofErr w:type="spellStart"/>
+      <w:r>
+        <w:t>chewR</w:t>
+      </w:r>
+      <w:proofErr w:type="spellEnd"/>
+    </w:p>
+    <w:p>
+      <w:pPr>
+        <w:rPr>
+          <w:b/>
+          <w:bCs/>
+          <w:color w:val="EE0000"/>
+        </w:rPr>
+      </w:pPr>
+    </w:p>
+    <w:p>
+      <w:pPr>
+        <w:rPr>
+          <w:b/>
+          <w:bCs/>
+        </w:rPr>
+      </w:pPr>
+      <w:r>
+        <w:rPr>
+          <w:b/>
+          <w:bCs/>
+        </w:rPr>
+        <w:t xml:space="preserve">If you use </w:t>
+      </w:r>
+      <w:proofErr w:type="spellStart"/>
+      <w:r>
+        <w:rPr>
+          <w:b/>
+          <w:bCs/>
+        </w:rPr>
+        <w:t>chewR</w:t>
+      </w:r>
+      <w:proofErr w:type="spellEnd"/>
+      <w:r>
+        <w:rPr>
+          <w:b/>
+          <w:bCs/>
+        </w:rPr>
+        <w:t xml:space="preserve"> in research, please cite:</w:t>
+      </w:r>
+    </w:p>
+    <w:p>
+      <w:r>
+        <w:t xml:space="preserve">Long JW (2026). </w:t>
+      </w:r>
+      <w:proofErr w:type="spellStart"/>
+      <w:r>
+        <w:t>chewR</w:t>
+      </w:r>
+      <w:proofErr w:type="spellEnd"/>
+      <w:r>
+        <w:t>: An Open-Source R Package for Quantifying Chewing Efficiency.</w:t>
+      </w:r>
+    </w:p>
+    <w:p>
+      <w:pPr>
+        <w:rPr>
+          <w:lang w:val="de-DE"/>
+        </w:rPr>
+      </w:pPr>
+      <w:r>
+        <w:rPr>
+          <w:lang w:val="de-DE"/>
+        </w:rPr>
+        <w:t>R package version 0.0.1.</w:t>
+      </w:r>
+    </w:p>
+    <w:p>
+      <w:pPr>
+        <w:rPr>
+          <w:lang w:val="de-DE"/>
+        </w:rPr>
+      </w:pPr>
+      <w:r>
+        <w:rPr>
+          <w:lang w:val="de-DE"/>
+        </w:rPr>
+        <w:t>https://github.com/JohnLongPhD/chewR</w:t>
+      </w:r>
+    </w:p>
+    <w:p>
+      <w:pPr>
+        <w:rPr>
+          <w:lang w:val="de-DE"/>
+        </w:rPr>
+      </w:pPr>
+    </w:p>
+    <w:p>
+      <w:r>
+        <w:t>You can also retrieve the citation directly in R with:</w:t>
+      </w:r>
+    </w:p>
+    <w:p>
+      <w:pPr>
+        <w:rPr>
+          <w:rFonts w:ascii="Courier New" w:eastAsia="Courier New" w:hAnsi="Courier New"/>
+          <w:sz w:val="19"/>
+        </w:rPr>
+      </w:pPr>
+      <w:r>
+        <w:rPr>
+          <w:rFonts w:ascii="Courier New" w:eastAsia="Courier New" w:hAnsi="Courier New"/>
+          <w:sz w:val="19"/>
+        </w:rPr>
+        <w:t>citation</w:t>
+      </w:r>
+      <w:r>
+        <w:rPr>
+          <w:rFonts w:ascii="Courier New" w:eastAsia="Courier New" w:hAnsi="Courier New"/>
+          <w:sz w:val="19"/>
+        </w:rPr>
+        <w:t>("</w:t>
+      </w:r>
+      <w:proofErr w:type="spellStart"/>
+      <w:r>
+        <w:rPr>
+          <w:rFonts w:ascii="Courier New" w:eastAsia="Courier New" w:hAnsi="Courier New"/>
+          <w:sz w:val="19"/>
+        </w:rPr>
+        <w:t>chewR</w:t>
+      </w:r>
+      <w:proofErr w:type="spellEnd"/>
+      <w:r>
+        <w:rPr>
+          <w:rFonts w:ascii="Courier New" w:eastAsia="Courier New" w:hAnsi="Courier New"/>
+          <w:sz w:val="19"/>
+        </w:rPr>
+        <w:t>")</w:t>
       </w:r>
     </w:p>
     <w:sectPr>

</xml_diff>

<commit_message>
Updated README, tutorials, and removed .Rhistory
</commit_message>
<xml_diff>
--- a/docs/chewR_tutorial.docx
+++ b/docs/chewR_tutorial.docx
@@ -7,13 +7,8 @@
         <w:pStyle w:val="Title"/>
         <w:jc w:val="center"/>
       </w:pPr>
-      <w:proofErr w:type="spellStart"/>
-      <w:r>
-        <w:t>chewR</w:t>
-      </w:r>
-      <w:proofErr w:type="spellEnd"/>
-      <w:r>
-        <w:t xml:space="preserve"> Quick Start Guide</w:t>
+      <w:r>
+        <w:t>chewR Quick Start Guide</w:t>
       </w:r>
     </w:p>
     <w:p>
@@ -36,21 +31,7 @@
         <w:rPr>
           <w:i/>
         </w:rPr>
-        <w:t xml:space="preserve"> the </w:t>
-      </w:r>
-      <w:proofErr w:type="spellStart"/>
-      <w:r>
-        <w:rPr>
-          <w:i/>
-        </w:rPr>
-        <w:t>chewR</w:t>
-      </w:r>
-      <w:proofErr w:type="spellEnd"/>
-      <w:r>
-        <w:rPr>
-          <w:i/>
-        </w:rPr>
-        <w:t xml:space="preserve"> package</w:t>
+        <w:t xml:space="preserve"> the chewR package</w:t>
       </w:r>
     </w:p>
     <w:p>
@@ -58,41 +39,12 @@
         <w:pStyle w:val="Heading1"/>
       </w:pPr>
       <w:r>
-        <w:t xml:space="preserve">1. What </w:t>
-      </w:r>
-      <w:proofErr w:type="spellStart"/>
-      <w:r>
-        <w:t>chewR</w:t>
-      </w:r>
-      <w:proofErr w:type="spellEnd"/>
-      <w:r>
-        <w:t xml:space="preserve"> does</w:t>
+        <w:t>1. What chewR does</w:t>
       </w:r>
     </w:p>
     <w:p>
-      <w:proofErr w:type="spellStart"/>
-      <w:r>
-        <w:t>chewR</w:t>
-      </w:r>
-      <w:proofErr w:type="spellEnd"/>
-      <w:r>
-        <w:t xml:space="preserve"> is an R package for processing scanned gum images and summarizing chewing efficiency using hue-based image analysis. The main function is </w:t>
-      </w:r>
-      <w:proofErr w:type="spellStart"/>
-      <w:r>
-        <w:t>run_chewr_</w:t>
-      </w:r>
-      <w:proofErr w:type="gramStart"/>
-      <w:r>
-        <w:t>pipeline</w:t>
-      </w:r>
-      <w:proofErr w:type="spellEnd"/>
-      <w:r>
-        <w:t>(</w:t>
-      </w:r>
-      <w:proofErr w:type="gramEnd"/>
-      <w:r>
-        <w:t>).</w:t>
+      <w:r>
+        <w:t>chewR is an R package for processing scanned gum images and summarizing chewing efficiency using hue-based image analysis. The main function is run_chewr_pipeline().</w:t>
       </w:r>
     </w:p>
     <w:p>
@@ -104,29 +56,8 @@
       </w:r>
     </w:p>
     <w:p>
-      <w:proofErr w:type="spellStart"/>
-      <w:r>
-        <w:t>chewR</w:t>
-      </w:r>
-      <w:proofErr w:type="spellEnd"/>
-      <w:r>
-        <w:t xml:space="preserve"> accepts the following file types: .</w:t>
-      </w:r>
-      <w:proofErr w:type="spellStart"/>
-      <w:r>
-        <w:t>png</w:t>
-      </w:r>
-      <w:proofErr w:type="spellEnd"/>
-      <w:r>
-        <w:t>, .jpg, .jpeg, .</w:t>
-      </w:r>
-      <w:proofErr w:type="spellStart"/>
-      <w:r>
-        <w:t>tif</w:t>
-      </w:r>
-      <w:proofErr w:type="spellEnd"/>
-      <w:r>
-        <w:t>, and .tiff.</w:t>
+      <w:r>
+        <w:t>chewR accepts the following file types: .png, .jpg, .jpeg, .tif, and .tiff.</w:t>
       </w:r>
       <w:r>
         <w:t xml:space="preserve"> </w:t>
@@ -148,15 +79,7 @@
         <w:t>Scan all gum images clearly and save them as image files</w:t>
       </w:r>
       <w:r>
-        <w:t xml:space="preserve"> (.</w:t>
-      </w:r>
-      <w:proofErr w:type="spellStart"/>
-      <w:r>
-        <w:t>png</w:t>
-      </w:r>
-      <w:proofErr w:type="spellEnd"/>
-      <w:r>
-        <w:t xml:space="preserve"> if possible)</w:t>
+        <w:t xml:space="preserve"> (.png if possible)</w:t>
       </w:r>
     </w:p>
     <w:p>
@@ -268,23 +191,7 @@
     </w:p>
     <w:p>
       <w:r>
-        <w:t xml:space="preserve">Rules: ID must be numeric only; side must be </w:t>
-      </w:r>
-      <w:proofErr w:type="gramStart"/>
-      <w:r>
-        <w:t>side1</w:t>
-      </w:r>
-      <w:proofErr w:type="gramEnd"/>
-      <w:r>
-        <w:t xml:space="preserve"> or </w:t>
-      </w:r>
-      <w:proofErr w:type="gramStart"/>
-      <w:r>
-        <w:t>side2</w:t>
-      </w:r>
-      <w:proofErr w:type="gramEnd"/>
-      <w:r>
-        <w:t>; chew count must be numeric.</w:t>
+        <w:t>Rules: ID must be numeric only; side must be side1 or side2; chew count must be numeric.</w:t>
       </w:r>
     </w:p>
     <w:p>
@@ -296,7 +203,13 @@
         </w:numPr>
       </w:pPr>
       <w:r>
-        <w:t>Here, 1 refers to the participant ID, the next string of text after the underscore refers to the number of chews, the final string of text after the second underscore refers to the front of back of the scan (side 1 and side 2)</w:t>
+        <w:t>Here, 1 refers to the participant ID, the next string of text after the underscore refers to the number of chews, the final string of text after the second underscore refers to the front o</w:t>
+      </w:r>
+      <w:r>
+        <w:t>r</w:t>
+      </w:r>
+      <w:r>
+        <w:t xml:space="preserve"> back of the scan (side 1 and side 2)</w:t>
       </w:r>
     </w:p>
     <w:p>
@@ -362,7 +275,13 @@
         </w:numPr>
       </w:pPr>
       <w:r>
-        <w:t>Here, 1 refers to the participant ID, the final string of text after the underscore refers to the front of back of the scan (side 1 and side 2)</w:t>
+        <w:t>Here, 1 refers to the participant ID, the final string of text after the underscore refers to the front o</w:t>
+      </w:r>
+      <w:r>
+        <w:t>r</w:t>
+      </w:r>
+      <w:r>
+        <w:t xml:space="preserve"> back of the scan (side 1 and side 2)</w:t>
       </w:r>
     </w:p>
     <w:p>
@@ -496,54 +415,107 @@
           <w:sz w:val="19"/>
         </w:rPr>
       </w:pPr>
-      <w:proofErr w:type="spellStart"/>
       <w:r>
         <w:rPr>
           <w:rFonts w:ascii="Courier New" w:eastAsia="Courier New" w:hAnsi="Courier New"/>
           <w:sz w:val="19"/>
         </w:rPr>
-        <w:t>setwd</w:t>
-      </w:r>
-      <w:proofErr w:type="spellEnd"/>
-      <w:r>
+        <w:t>setwd("C:/path/to/your/image_folder")</w:t>
+      </w:r>
+    </w:p>
+    <w:p/>
+    <w:p>
+      <w:r>
+        <w:t>You can confirm your working directory by running:</w:t>
+      </w:r>
+    </w:p>
+    <w:p>
+      <w:pPr>
         <w:rPr>
           <w:rFonts w:ascii="Courier New" w:eastAsia="Courier New" w:hAnsi="Courier New"/>
           <w:sz w:val="19"/>
         </w:rPr>
-        <w:t>("C:/path/to/your/image_folder")</w:t>
-      </w:r>
-    </w:p>
-    <w:p/>
-    <w:p>
-      <w:r>
-        <w:t>You can confirm your working directory by running:</w:t>
-      </w:r>
-    </w:p>
-    <w:p>
-      <w:pPr>
+      </w:pPr>
+      <w:r>
         <w:rPr>
           <w:rFonts w:ascii="Courier New" w:eastAsia="Courier New" w:hAnsi="Courier New"/>
           <w:sz w:val="19"/>
         </w:rPr>
-      </w:pPr>
-      <w:proofErr w:type="spellStart"/>
-      <w:proofErr w:type="gramStart"/>
+        <w:t>getwd()</w:t>
+      </w:r>
+    </w:p>
+    <w:p>
+      <w:pPr>
+        <w:pStyle w:val="Heading1"/>
+      </w:pPr>
+      <w:r>
+        <w:t xml:space="preserve">6. </w:t>
+      </w:r>
+      <w:r>
+        <w:t>Install, l</w:t>
+      </w:r>
+      <w:r>
+        <w:t>oad the package</w:t>
+      </w:r>
+      <w:r>
+        <w:t>,</w:t>
+      </w:r>
+      <w:r>
+        <w:t xml:space="preserve"> and run the pipeline</w:t>
+      </w:r>
+    </w:p>
+    <w:p>
+      <w:pPr>
+        <w:rPr>
+          <w:b/>
+          <w:bCs/>
+        </w:rPr>
+      </w:pPr>
+    </w:p>
+    <w:p>
+      <w:pPr>
+        <w:rPr>
+          <w:b/>
+          <w:bCs/>
+        </w:rPr>
+      </w:pPr>
+      <w:r>
+        <w:rPr>
+          <w:b/>
+          <w:bCs/>
+        </w:rPr>
+        <w:t>Run the following code in your R:</w:t>
+      </w:r>
+    </w:p>
+    <w:p>
       <w:r>
         <w:rPr>
           <w:rFonts w:ascii="Courier New" w:eastAsia="Courier New" w:hAnsi="Courier New"/>
           <w:sz w:val="19"/>
         </w:rPr>
-        <w:t>getwd</w:t>
-      </w:r>
-      <w:proofErr w:type="spellEnd"/>
+        <w:t>install.packages(</w:t>
+      </w:r>
       <w:r>
         <w:rPr>
           <w:rFonts w:ascii="Courier New" w:eastAsia="Courier New" w:hAnsi="Courier New"/>
           <w:sz w:val="19"/>
         </w:rPr>
-        <w:t>(</w:t>
-      </w:r>
-      <w:proofErr w:type="gramEnd"/>
+        <w:t>"</w:t>
+      </w:r>
+      <w:r>
+        <w:rPr>
+          <w:rFonts w:ascii="Courier New" w:eastAsia="Courier New" w:hAnsi="Courier New"/>
+          <w:sz w:val="19"/>
+        </w:rPr>
+        <w:t>devtools</w:t>
+      </w:r>
+      <w:r>
+        <w:rPr>
+          <w:rFonts w:ascii="Courier New" w:eastAsia="Courier New" w:hAnsi="Courier New"/>
+          <w:sz w:val="19"/>
+        </w:rPr>
+        <w:t>"</w:t>
+      </w:r>
       <w:r>
         <w:rPr>
           <w:rFonts w:ascii="Courier New" w:eastAsia="Courier New" w:hAnsi="Courier New"/>
@@ -553,66 +525,12 @@
       </w:r>
     </w:p>
     <w:p>
-      <w:pPr>
-        <w:pStyle w:val="Heading1"/>
-      </w:pPr>
-      <w:r>
-        <w:t xml:space="preserve">6. </w:t>
-      </w:r>
-      <w:r>
-        <w:t>Install, l</w:t>
-      </w:r>
-      <w:r>
-        <w:t>oad the package</w:t>
-      </w:r>
-      <w:r>
-        <w:t>,</w:t>
-      </w:r>
-      <w:r>
-        <w:t xml:space="preserve"> and run the pipeline</w:t>
-      </w:r>
-    </w:p>
-    <w:p>
-      <w:pPr>
-        <w:rPr>
-          <w:b/>
-          <w:bCs/>
-        </w:rPr>
-      </w:pPr>
-    </w:p>
-    <w:p>
-      <w:pPr>
-        <w:rPr>
-          <w:b/>
-          <w:bCs/>
-        </w:rPr>
-      </w:pPr>
-      <w:r>
-        <w:rPr>
-          <w:b/>
-          <w:bCs/>
-        </w:rPr>
-        <w:t>Run the following code in your R:</w:t>
-      </w:r>
-    </w:p>
-    <w:p>
-      <w:proofErr w:type="spellStart"/>
-      <w:proofErr w:type="gramStart"/>
       <w:r>
         <w:rPr>
           <w:rFonts w:ascii="Courier New" w:eastAsia="Courier New" w:hAnsi="Courier New"/>
           <w:sz w:val="19"/>
         </w:rPr>
-        <w:t>install.packages</w:t>
-      </w:r>
-      <w:proofErr w:type="spellEnd"/>
-      <w:proofErr w:type="gramEnd"/>
-      <w:r>
-        <w:rPr>
-          <w:rFonts w:ascii="Courier New" w:eastAsia="Courier New" w:hAnsi="Courier New"/>
-          <w:sz w:val="19"/>
-        </w:rPr>
-        <w:t>(</w:t>
+        <w:t>devtools::install_github(</w:t>
       </w:r>
       <w:r>
         <w:rPr>
@@ -621,15 +539,13 @@
         </w:rPr>
         <w:t>"</w:t>
       </w:r>
-      <w:proofErr w:type="spellStart"/>
       <w:r>
         <w:rPr>
           <w:rFonts w:ascii="Courier New" w:eastAsia="Courier New" w:hAnsi="Courier New"/>
           <w:sz w:val="19"/>
         </w:rPr>
-        <w:t>devtools</w:t>
-      </w:r>
-      <w:proofErr w:type="spellEnd"/>
+        <w:t>JohnLongPhD/chewR</w:t>
+      </w:r>
       <w:r>
         <w:rPr>
           <w:rFonts w:ascii="Courier New" w:eastAsia="Courier New" w:hAnsi="Courier New"/>
@@ -645,100 +561,10 @@
         <w:t>)</w:t>
       </w:r>
     </w:p>
-    <w:p>
-      <w:proofErr w:type="spellStart"/>
-      <w:proofErr w:type="gramStart"/>
-      <w:r>
-        <w:rPr>
-          <w:rFonts w:ascii="Courier New" w:eastAsia="Courier New" w:hAnsi="Courier New"/>
-          <w:sz w:val="19"/>
-        </w:rPr>
-        <w:t>devtools</w:t>
-      </w:r>
-      <w:proofErr w:type="spellEnd"/>
-      <w:r>
-        <w:rPr>
-          <w:rFonts w:ascii="Courier New" w:eastAsia="Courier New" w:hAnsi="Courier New"/>
-          <w:sz w:val="19"/>
-        </w:rPr>
-        <w:t>::</w:t>
-      </w:r>
-      <w:proofErr w:type="spellStart"/>
-      <w:proofErr w:type="gramEnd"/>
-      <w:r>
-        <w:rPr>
-          <w:rFonts w:ascii="Courier New" w:eastAsia="Courier New" w:hAnsi="Courier New"/>
-          <w:sz w:val="19"/>
-        </w:rPr>
-        <w:t>install_github</w:t>
-      </w:r>
-      <w:proofErr w:type="spellEnd"/>
-      <w:r>
-        <w:rPr>
-          <w:rFonts w:ascii="Courier New" w:eastAsia="Courier New" w:hAnsi="Courier New"/>
-          <w:sz w:val="19"/>
-        </w:rPr>
-        <w:t>(</w:t>
-      </w:r>
-      <w:r>
-        <w:rPr>
-          <w:rFonts w:ascii="Courier New" w:eastAsia="Courier New" w:hAnsi="Courier New"/>
-          <w:sz w:val="19"/>
-        </w:rPr>
-        <w:t>"</w:t>
-      </w:r>
-      <w:proofErr w:type="spellStart"/>
-      <w:r>
-        <w:rPr>
-          <w:rFonts w:ascii="Courier New" w:eastAsia="Courier New" w:hAnsi="Courier New"/>
-          <w:sz w:val="19"/>
-        </w:rPr>
-        <w:t>JohnLongPhD</w:t>
-      </w:r>
-      <w:proofErr w:type="spellEnd"/>
-      <w:r>
-        <w:rPr>
-          <w:rFonts w:ascii="Courier New" w:eastAsia="Courier New" w:hAnsi="Courier New"/>
-          <w:sz w:val="19"/>
-        </w:rPr>
-        <w:t>/</w:t>
-      </w:r>
-      <w:proofErr w:type="spellStart"/>
-      <w:r>
-        <w:rPr>
-          <w:rFonts w:ascii="Courier New" w:eastAsia="Courier New" w:hAnsi="Courier New"/>
-          <w:sz w:val="19"/>
-        </w:rPr>
-        <w:t>chewR</w:t>
-      </w:r>
-      <w:proofErr w:type="spellEnd"/>
-      <w:r>
-        <w:rPr>
-          <w:rFonts w:ascii="Courier New" w:eastAsia="Courier New" w:hAnsi="Courier New"/>
-          <w:sz w:val="19"/>
-        </w:rPr>
-        <w:t>"</w:t>
-      </w:r>
-      <w:r>
-        <w:rPr>
-          <w:rFonts w:ascii="Courier New" w:eastAsia="Courier New" w:hAnsi="Courier New"/>
-          <w:sz w:val="19"/>
-        </w:rPr>
-        <w:t>)</w:t>
-      </w:r>
-    </w:p>
     <w:p/>
     <w:p>
       <w:r>
-        <w:t xml:space="preserve">If </w:t>
-      </w:r>
-      <w:proofErr w:type="spellStart"/>
-      <w:r>
-        <w:t>devtools</w:t>
-      </w:r>
-      <w:proofErr w:type="spellEnd"/>
-      <w:r>
-        <w:t xml:space="preserve"> does not install</w:t>
+        <w:t>If devtools does not install</w:t>
       </w:r>
       <w:r>
         <w:t xml:space="preserve"> from the code above</w:t>
@@ -821,17 +647,64 @@
           <w:rFonts w:ascii="Courier New" w:eastAsia="Courier New" w:hAnsi="Courier New"/>
           <w:sz w:val="19"/>
         </w:rPr>
-        <w:t>library(</w:t>
-      </w:r>
-      <w:proofErr w:type="spellStart"/>
+        <w:t>library(chewR)</w:t>
+      </w:r>
+    </w:p>
+    <w:p>
       <w:r>
         <w:rPr>
           <w:rFonts w:ascii="Courier New" w:eastAsia="Courier New" w:hAnsi="Courier New"/>
           <w:sz w:val="19"/>
         </w:rPr>
-        <w:t>chewR</w:t>
-      </w:r>
-      <w:proofErr w:type="spellEnd"/>
+        <w:t>pipeline_results &lt;- run_chewr_pipeline(</w:t>
+      </w:r>
+    </w:p>
+    <w:p>
+      <w:r>
+        <w:rPr>
+          <w:rFonts w:ascii="Courier New" w:eastAsia="Courier New" w:hAnsi="Courier New"/>
+          <w:sz w:val="19"/>
+        </w:rPr>
+        <w:t xml:space="preserve">  protocol             = "chew",</w:t>
+      </w:r>
+    </w:p>
+    <w:p>
+      <w:r>
+        <w:rPr>
+          <w:rFonts w:ascii="Courier New" w:eastAsia="Courier New" w:hAnsi="Courier New"/>
+          <w:sz w:val="19"/>
+        </w:rPr>
+        <w:t xml:space="preserve">  output_excel_path    = "chewR_results.xlsx",</w:t>
+      </w:r>
+    </w:p>
+    <w:p>
+      <w:r>
+        <w:rPr>
+          <w:rFonts w:ascii="Courier New" w:eastAsia="Courier New" w:hAnsi="Courier New"/>
+          <w:sz w:val="19"/>
+        </w:rPr>
+        <w:t xml:space="preserve">  output_plot_dir      = "chewR_plots",</w:t>
+      </w:r>
+    </w:p>
+    <w:p>
+      <w:r>
+        <w:rPr>
+          <w:rFonts w:ascii="Courier New" w:eastAsia="Courier New" w:hAnsi="Courier New"/>
+          <w:sz w:val="19"/>
+        </w:rPr>
+        <w:t xml:space="preserve">  auto_crop            = TRUE,</w:t>
+      </w:r>
+    </w:p>
+    <w:p>
+      <w:r>
+        <w:rPr>
+          <w:rFonts w:ascii="Courier New" w:eastAsia="Courier New" w:hAnsi="Courier New"/>
+          <w:sz w:val="19"/>
+        </w:rPr>
+        <w:t xml:space="preserve">  save_analysis_images = TRUE</w:t>
+      </w:r>
+    </w:p>
+    <w:p>
       <w:r>
         <w:rPr>
           <w:rFonts w:ascii="Courier New" w:eastAsia="Courier New" w:hAnsi="Courier New"/>
@@ -840,8 +713,8 @@
         <w:t>)</w:t>
       </w:r>
     </w:p>
+    <w:p/>
     <w:p>
-      <w:proofErr w:type="spellStart"/>
       <w:r>
         <w:rPr>
           <w:rFonts w:ascii="Courier New" w:eastAsia="Courier New" w:hAnsi="Courier New"/>
@@ -849,185 +722,6 @@
         </w:rPr>
         <w:t>pipeline_results</w:t>
       </w:r>
-      <w:proofErr w:type="spellEnd"/>
-      <w:r>
-        <w:rPr>
-          <w:rFonts w:ascii="Courier New" w:eastAsia="Courier New" w:hAnsi="Courier New"/>
-          <w:sz w:val="19"/>
-        </w:rPr>
-        <w:t xml:space="preserve"> &lt;- </w:t>
-      </w:r>
-      <w:proofErr w:type="spellStart"/>
-      <w:r>
-        <w:rPr>
-          <w:rFonts w:ascii="Courier New" w:eastAsia="Courier New" w:hAnsi="Courier New"/>
-          <w:sz w:val="19"/>
-        </w:rPr>
-        <w:t>run_chewr_</w:t>
-      </w:r>
-      <w:proofErr w:type="gramStart"/>
-      <w:r>
-        <w:rPr>
-          <w:rFonts w:ascii="Courier New" w:eastAsia="Courier New" w:hAnsi="Courier New"/>
-          <w:sz w:val="19"/>
-        </w:rPr>
-        <w:t>pipeline</w:t>
-      </w:r>
-      <w:proofErr w:type="spellEnd"/>
-      <w:r>
-        <w:rPr>
-          <w:rFonts w:ascii="Courier New" w:eastAsia="Courier New" w:hAnsi="Courier New"/>
-          <w:sz w:val="19"/>
-        </w:rPr>
-        <w:t>(</w:t>
-      </w:r>
-      <w:proofErr w:type="gramEnd"/>
-    </w:p>
-    <w:p>
-      <w:r>
-        <w:rPr>
-          <w:rFonts w:ascii="Courier New" w:eastAsia="Courier New" w:hAnsi="Courier New"/>
-          <w:sz w:val="19"/>
-        </w:rPr>
-        <w:t xml:space="preserve">  protocol             = "chew",</w:t>
-      </w:r>
-    </w:p>
-    <w:p>
-      <w:r>
-        <w:rPr>
-          <w:rFonts w:ascii="Courier New" w:eastAsia="Courier New" w:hAnsi="Courier New"/>
-          <w:sz w:val="19"/>
-        </w:rPr>
-        <w:t xml:space="preserve">  </w:t>
-      </w:r>
-      <w:proofErr w:type="spellStart"/>
-      <w:r>
-        <w:rPr>
-          <w:rFonts w:ascii="Courier New" w:eastAsia="Courier New" w:hAnsi="Courier New"/>
-          <w:sz w:val="19"/>
-        </w:rPr>
-        <w:t>output_excel_path</w:t>
-      </w:r>
-      <w:proofErr w:type="spellEnd"/>
-      <w:r>
-        <w:rPr>
-          <w:rFonts w:ascii="Courier New" w:eastAsia="Courier New" w:hAnsi="Courier New"/>
-          <w:sz w:val="19"/>
-        </w:rPr>
-        <w:t xml:space="preserve">    = "chewR_results.xlsx",</w:t>
-      </w:r>
-    </w:p>
-    <w:p>
-      <w:r>
-        <w:rPr>
-          <w:rFonts w:ascii="Courier New" w:eastAsia="Courier New" w:hAnsi="Courier New"/>
-          <w:sz w:val="19"/>
-        </w:rPr>
-        <w:t xml:space="preserve">  </w:t>
-      </w:r>
-      <w:proofErr w:type="spellStart"/>
-      <w:r>
-        <w:rPr>
-          <w:rFonts w:ascii="Courier New" w:eastAsia="Courier New" w:hAnsi="Courier New"/>
-          <w:sz w:val="19"/>
-        </w:rPr>
-        <w:t>output_plot_dir</w:t>
-      </w:r>
-      <w:proofErr w:type="spellEnd"/>
-      <w:r>
-        <w:rPr>
-          <w:rFonts w:ascii="Courier New" w:eastAsia="Courier New" w:hAnsi="Courier New"/>
-          <w:sz w:val="19"/>
-        </w:rPr>
-        <w:t xml:space="preserve">      = "</w:t>
-      </w:r>
-      <w:proofErr w:type="spellStart"/>
-      <w:r>
-        <w:rPr>
-          <w:rFonts w:ascii="Courier New" w:eastAsia="Courier New" w:hAnsi="Courier New"/>
-          <w:sz w:val="19"/>
-        </w:rPr>
-        <w:t>chewR_plots</w:t>
-      </w:r>
-      <w:proofErr w:type="spellEnd"/>
-      <w:r>
-        <w:rPr>
-          <w:rFonts w:ascii="Courier New" w:eastAsia="Courier New" w:hAnsi="Courier New"/>
-          <w:sz w:val="19"/>
-        </w:rPr>
-        <w:t>",</w:t>
-      </w:r>
-    </w:p>
-    <w:p>
-      <w:r>
-        <w:rPr>
-          <w:rFonts w:ascii="Courier New" w:eastAsia="Courier New" w:hAnsi="Courier New"/>
-          <w:sz w:val="19"/>
-        </w:rPr>
-        <w:t xml:space="preserve">  </w:t>
-      </w:r>
-      <w:proofErr w:type="spellStart"/>
-      <w:r>
-        <w:rPr>
-          <w:rFonts w:ascii="Courier New" w:eastAsia="Courier New" w:hAnsi="Courier New"/>
-          <w:sz w:val="19"/>
-        </w:rPr>
-        <w:t>auto_crop</w:t>
-      </w:r>
-      <w:proofErr w:type="spellEnd"/>
-      <w:r>
-        <w:rPr>
-          <w:rFonts w:ascii="Courier New" w:eastAsia="Courier New" w:hAnsi="Courier New"/>
-          <w:sz w:val="19"/>
-        </w:rPr>
-        <w:t xml:space="preserve">            = TRUE,</w:t>
-      </w:r>
-    </w:p>
-    <w:p>
-      <w:r>
-        <w:rPr>
-          <w:rFonts w:ascii="Courier New" w:eastAsia="Courier New" w:hAnsi="Courier New"/>
-          <w:sz w:val="19"/>
-        </w:rPr>
-        <w:t xml:space="preserve">  </w:t>
-      </w:r>
-      <w:proofErr w:type="spellStart"/>
-      <w:r>
-        <w:rPr>
-          <w:rFonts w:ascii="Courier New" w:eastAsia="Courier New" w:hAnsi="Courier New"/>
-          <w:sz w:val="19"/>
-        </w:rPr>
-        <w:t>save_analysis_images</w:t>
-      </w:r>
-      <w:proofErr w:type="spellEnd"/>
-      <w:r>
-        <w:rPr>
-          <w:rFonts w:ascii="Courier New" w:eastAsia="Courier New" w:hAnsi="Courier New"/>
-          <w:sz w:val="19"/>
-        </w:rPr>
-        <w:t xml:space="preserve"> = TRUE</w:t>
-      </w:r>
-    </w:p>
-    <w:p>
-      <w:r>
-        <w:rPr>
-          <w:rFonts w:ascii="Courier New" w:eastAsia="Courier New" w:hAnsi="Courier New"/>
-          <w:sz w:val="19"/>
-        </w:rPr>
-        <w:t>)</w:t>
-      </w:r>
-    </w:p>
-    <w:p/>
-    <w:p>
-      <w:proofErr w:type="spellStart"/>
-      <w:r>
-        <w:rPr>
-          <w:rFonts w:ascii="Courier New" w:eastAsia="Courier New" w:hAnsi="Courier New"/>
-          <w:sz w:val="19"/>
-        </w:rPr>
-        <w:t>pipeline_results</w:t>
-      </w:r>
-      <w:proofErr w:type="spellEnd"/>
     </w:p>
     <w:p/>
     <w:p>
@@ -1059,67 +753,17 @@
           <w:rFonts w:ascii="Courier New" w:eastAsia="Courier New" w:hAnsi="Courier New"/>
           <w:sz w:val="19"/>
         </w:rPr>
-        <w:t>library(</w:t>
-      </w:r>
-      <w:proofErr w:type="spellStart"/>
+        <w:t>library(chewR)</w:t>
+      </w:r>
+    </w:p>
+    <w:p>
       <w:r>
         <w:rPr>
           <w:rFonts w:ascii="Courier New" w:eastAsia="Courier New" w:hAnsi="Courier New"/>
           <w:sz w:val="19"/>
         </w:rPr>
-        <w:t>chewR</w:t>
-      </w:r>
-      <w:proofErr w:type="spellEnd"/>
-      <w:r>
-        <w:rPr>
-          <w:rFonts w:ascii="Courier New" w:eastAsia="Courier New" w:hAnsi="Courier New"/>
-          <w:sz w:val="19"/>
-        </w:rPr>
-        <w:t>)</w:t>
-      </w:r>
-    </w:p>
-    <w:p>
-      <w:proofErr w:type="spellStart"/>
-      <w:r>
-        <w:rPr>
-          <w:rFonts w:ascii="Courier New" w:eastAsia="Courier New" w:hAnsi="Courier New"/>
-          <w:sz w:val="19"/>
-        </w:rPr>
-        <w:t>pipeline_results</w:t>
-      </w:r>
-      <w:proofErr w:type="spellEnd"/>
-      <w:r>
-        <w:rPr>
-          <w:rFonts w:ascii="Courier New" w:eastAsia="Courier New" w:hAnsi="Courier New"/>
-          <w:sz w:val="19"/>
-        </w:rPr>
-        <w:t xml:space="preserve"> &lt;- </w:t>
-      </w:r>
-      <w:proofErr w:type="spellStart"/>
-      <w:r>
-        <w:rPr>
-          <w:rFonts w:ascii="Courier New" w:eastAsia="Courier New" w:hAnsi="Courier New"/>
-          <w:sz w:val="19"/>
-        </w:rPr>
-        <w:t>run_chewr_</w:t>
-      </w:r>
-      <w:proofErr w:type="gramStart"/>
-      <w:r>
-        <w:rPr>
-          <w:rFonts w:ascii="Courier New" w:eastAsia="Courier New" w:hAnsi="Courier New"/>
-          <w:sz w:val="19"/>
-        </w:rPr>
-        <w:t>pipeline</w:t>
-      </w:r>
-      <w:proofErr w:type="spellEnd"/>
-      <w:r>
-        <w:rPr>
-          <w:rFonts w:ascii="Courier New" w:eastAsia="Courier New" w:hAnsi="Courier New"/>
-          <w:sz w:val="19"/>
-        </w:rPr>
-        <w:t>(</w:t>
-      </w:r>
-      <w:proofErr w:type="gramEnd"/>
+        <w:t>pipeline_results &lt;- run_chewr_pipeline(</w:t>
+      </w:r>
     </w:p>
     <w:p>
       <w:r>
@@ -1136,23 +780,25 @@
           <w:rFonts w:ascii="Courier New" w:eastAsia="Courier New" w:hAnsi="Courier New"/>
           <w:sz w:val="19"/>
         </w:rPr>
-        <w:t xml:space="preserve">  </w:t>
-      </w:r>
-      <w:proofErr w:type="spellStart"/>
+        <w:t xml:space="preserve">  output_excel_path    = "chewR_results.xlsx",</w:t>
+      </w:r>
+    </w:p>
+    <w:p>
       <w:r>
         <w:rPr>
           <w:rFonts w:ascii="Courier New" w:eastAsia="Courier New" w:hAnsi="Courier New"/>
           <w:sz w:val="19"/>
         </w:rPr>
-        <w:t>output_excel_path</w:t>
-      </w:r>
-      <w:proofErr w:type="spellEnd"/>
+        <w:t xml:space="preserve">  output_plot_dir      = "chewR_plots",</w:t>
+      </w:r>
+    </w:p>
+    <w:p>
       <w:r>
         <w:rPr>
           <w:rFonts w:ascii="Courier New" w:eastAsia="Courier New" w:hAnsi="Courier New"/>
           <w:sz w:val="19"/>
         </w:rPr>
-        <w:t xml:space="preserve">    = "chewR_results.xlsx",</w:t>
+        <w:t xml:space="preserve">  auto_crop            = TRUE,</w:t>
       </w:r>
     </w:p>
     <w:p>
@@ -1161,89 +807,7 @@
           <w:rFonts w:ascii="Courier New" w:eastAsia="Courier New" w:hAnsi="Courier New"/>
           <w:sz w:val="19"/>
         </w:rPr>
-        <w:t xml:space="preserve">  </w:t>
-      </w:r>
-      <w:proofErr w:type="spellStart"/>
-      <w:r>
-        <w:rPr>
-          <w:rFonts w:ascii="Courier New" w:eastAsia="Courier New" w:hAnsi="Courier New"/>
-          <w:sz w:val="19"/>
-        </w:rPr>
-        <w:t>output_plot_dir</w:t>
-      </w:r>
-      <w:proofErr w:type="spellEnd"/>
-      <w:r>
-        <w:rPr>
-          <w:rFonts w:ascii="Courier New" w:eastAsia="Courier New" w:hAnsi="Courier New"/>
-          <w:sz w:val="19"/>
-        </w:rPr>
-        <w:t xml:space="preserve">      = "</w:t>
-      </w:r>
-      <w:proofErr w:type="spellStart"/>
-      <w:r>
-        <w:rPr>
-          <w:rFonts w:ascii="Courier New" w:eastAsia="Courier New" w:hAnsi="Courier New"/>
-          <w:sz w:val="19"/>
-        </w:rPr>
-        <w:t>chewR_plots</w:t>
-      </w:r>
-      <w:proofErr w:type="spellEnd"/>
-      <w:r>
-        <w:rPr>
-          <w:rFonts w:ascii="Courier New" w:eastAsia="Courier New" w:hAnsi="Courier New"/>
-          <w:sz w:val="19"/>
-        </w:rPr>
-        <w:t>",</w:t>
-      </w:r>
-    </w:p>
-    <w:p>
-      <w:r>
-        <w:rPr>
-          <w:rFonts w:ascii="Courier New" w:eastAsia="Courier New" w:hAnsi="Courier New"/>
-          <w:sz w:val="19"/>
-        </w:rPr>
-        <w:t xml:space="preserve">  </w:t>
-      </w:r>
-      <w:proofErr w:type="spellStart"/>
-      <w:r>
-        <w:rPr>
-          <w:rFonts w:ascii="Courier New" w:eastAsia="Courier New" w:hAnsi="Courier New"/>
-          <w:sz w:val="19"/>
-        </w:rPr>
-        <w:t>auto_crop</w:t>
-      </w:r>
-      <w:proofErr w:type="spellEnd"/>
-      <w:r>
-        <w:rPr>
-          <w:rFonts w:ascii="Courier New" w:eastAsia="Courier New" w:hAnsi="Courier New"/>
-          <w:sz w:val="19"/>
-        </w:rPr>
-        <w:t xml:space="preserve">            = TRUE,</w:t>
-      </w:r>
-    </w:p>
-    <w:p>
-      <w:r>
-        <w:rPr>
-          <w:rFonts w:ascii="Courier New" w:eastAsia="Courier New" w:hAnsi="Courier New"/>
-          <w:sz w:val="19"/>
-        </w:rPr>
-        <w:t xml:space="preserve">  </w:t>
-      </w:r>
-      <w:proofErr w:type="spellStart"/>
-      <w:r>
-        <w:rPr>
-          <w:rFonts w:ascii="Courier New" w:eastAsia="Courier New" w:hAnsi="Courier New"/>
-          <w:sz w:val="19"/>
-        </w:rPr>
-        <w:t>save_analysis_images</w:t>
-      </w:r>
-      <w:proofErr w:type="spellEnd"/>
-      <w:r>
-        <w:rPr>
-          <w:rFonts w:ascii="Courier New" w:eastAsia="Courier New" w:hAnsi="Courier New"/>
-          <w:sz w:val="19"/>
-        </w:rPr>
-        <w:t xml:space="preserve"> = TRUE</w:t>
+        <w:t xml:space="preserve">  save_analysis_images = TRUE</w:t>
       </w:r>
     </w:p>
     <w:p>
@@ -1271,21 +835,13 @@
     <w:p>
       <w:r>
         <w:lastRenderedPageBreak/>
-        <w:t xml:space="preserve">In both formats, run the </w:t>
-      </w:r>
-      <w:proofErr w:type="spellStart"/>
-      <w:r>
-        <w:t>run_c</w:t>
+        <w:t>In both formats, run the run_c</w:t>
       </w:r>
       <w:r>
         <w:t>h</w:t>
       </w:r>
       <w:r>
-        <w:t>ewr_pipeline</w:t>
-      </w:r>
-      <w:proofErr w:type="spellEnd"/>
-      <w:r>
-        <w:t xml:space="preserve"> and these are the various modifications:</w:t>
+        <w:t>ewr_pipeline and these are the various modifications:</w:t>
       </w:r>
     </w:p>
     <w:p>
@@ -1332,21 +888,8 @@
           <w:numId w:val="10"/>
         </w:numPr>
       </w:pPr>
-      <w:proofErr w:type="spellStart"/>
-      <w:r>
-        <w:t>output_excel_path</w:t>
-      </w:r>
-      <w:proofErr w:type="spellEnd"/>
-      <w:r>
-        <w:t xml:space="preserve"> = the name of </w:t>
-      </w:r>
-      <w:proofErr w:type="gramStart"/>
-      <w:r>
-        <w:t>your</w:t>
-      </w:r>
-      <w:proofErr w:type="gramEnd"/>
-      <w:r>
-        <w:t xml:space="preserve"> excel spreadsheet that is generated once all your images have been analyzed</w:t>
+      <w:r>
+        <w:t>output_excel_path = the name of your excel spreadsheet that is generated once all your images have been analyzed</w:t>
       </w:r>
     </w:p>
     <w:p>
@@ -1357,13 +900,8 @@
           <w:numId w:val="10"/>
         </w:numPr>
       </w:pPr>
-      <w:proofErr w:type="spellStart"/>
-      <w:r>
-        <w:t>output_plot_dir</w:t>
-      </w:r>
-      <w:proofErr w:type="spellEnd"/>
-      <w:r>
-        <w:t xml:space="preserve"> = the name of the folder that will contain the images used in the analysis </w:t>
+      <w:r>
+        <w:t xml:space="preserve">output_plot_dir = the name of the folder that will contain the images used in the analysis </w:t>
       </w:r>
     </w:p>
     <w:p>
@@ -1374,16 +912,11 @@
           <w:numId w:val="10"/>
         </w:numPr>
       </w:pPr>
-      <w:proofErr w:type="spellStart"/>
       <w:r>
         <w:t>a</w:t>
       </w:r>
       <w:r>
-        <w:t>uto_crop</w:t>
-      </w:r>
-      <w:proofErr w:type="spellEnd"/>
-      <w:r>
-        <w:t xml:space="preserve"> = “TRUE” or “FALSE”</w:t>
+        <w:t>uto_crop = “TRUE” or “FALSE”</w:t>
       </w:r>
     </w:p>
     <w:p>
@@ -1418,13 +951,8 @@
           <w:numId w:val="10"/>
         </w:numPr>
       </w:pPr>
-      <w:proofErr w:type="spellStart"/>
-      <w:r>
-        <w:t>save_analysis_images</w:t>
-      </w:r>
-      <w:proofErr w:type="spellEnd"/>
-      <w:r>
-        <w:t xml:space="preserve"> = “TRUE” or “FALSE”</w:t>
+      <w:r>
+        <w:t>save_analysis_images = “TRUE” or “FALSE”</w:t>
       </w:r>
     </w:p>
     <w:p>
@@ -1472,28 +1000,15 @@
         <w:pStyle w:val="ListBullet"/>
       </w:pPr>
       <w:r>
-        <w:t xml:space="preserve">An output folder, usually named </w:t>
-      </w:r>
-      <w:proofErr w:type="spellStart"/>
-      <w:r>
-        <w:t>chewR_plots</w:t>
-      </w:r>
-      <w:proofErr w:type="spellEnd"/>
+        <w:t>An output folder, usually named chewR_plots</w:t>
+      </w:r>
     </w:p>
     <w:p>
       <w:pPr>
         <w:pStyle w:val="ListBullet"/>
       </w:pPr>
       <w:r>
-        <w:t xml:space="preserve">A subfolder of cropped analysis images if </w:t>
-      </w:r>
-      <w:proofErr w:type="spellStart"/>
-      <w:r>
-        <w:t>save_analysis_images</w:t>
-      </w:r>
-      <w:proofErr w:type="spellEnd"/>
-      <w:r>
-        <w:t xml:space="preserve"> = TRUE</w:t>
+        <w:t>A subfolder of cropped analysis images if save_analysis_images = TRUE</w:t>
       </w:r>
     </w:p>
     <w:p>
@@ -1517,13 +1032,8 @@
           <w:numId w:val="14"/>
         </w:numPr>
       </w:pPr>
-      <w:proofErr w:type="spellStart"/>
-      <w:r>
-        <w:t>summary_sides_combined</w:t>
-      </w:r>
-      <w:proofErr w:type="spellEnd"/>
-      <w:r>
-        <w:t>: pooled result across both sides</w:t>
+      <w:r>
+        <w:t>summary_sides_combined: pooled result across both sides</w:t>
       </w:r>
     </w:p>
     <w:p>
@@ -1534,46 +1044,20 @@
           <w:numId w:val="13"/>
         </w:numPr>
       </w:pPr>
-      <w:proofErr w:type="spellStart"/>
-      <w:r>
-        <w:t>summary_by_side</w:t>
-      </w:r>
-      <w:proofErr w:type="spellEnd"/>
-      <w:r>
-        <w:t>: side-specific result</w:t>
+      <w:r>
+        <w:t>summary_by_side: side-specific result</w:t>
       </w:r>
     </w:p>
     <w:p>
       <w:r>
-        <w:t xml:space="preserve">Use the </w:t>
-      </w:r>
-      <w:proofErr w:type="spellStart"/>
-      <w:r>
-        <w:t>summary_sides_combined</w:t>
-      </w:r>
-      <w:proofErr w:type="spellEnd"/>
-      <w:r>
-        <w:t xml:space="preserve"> data for analyses.</w:t>
+        <w:t>Use the summary_sides_combined data for analyses.</w:t>
       </w:r>
     </w:p>
     <w:p/>
     <w:p>
       <w:r>
-        <w:t xml:space="preserve">You should also see score columns including </w:t>
-      </w:r>
-      <w:proofErr w:type="spellStart"/>
-      <w:r>
-        <w:t>chewr_raw_score</w:t>
-      </w:r>
-      <w:proofErr w:type="spellEnd"/>
-      <w:r>
-        <w:t xml:space="preserve"> and </w:t>
-      </w:r>
-      <w:proofErr w:type="spellStart"/>
-      <w:r>
-        <w:t>chewr_chewing_efficiency_score</w:t>
-      </w:r>
-      <w:proofErr w:type="spellEnd"/>
+        <w:t>You should also see score columns including chewr_raw_score and chewr_chewing_efficiency_score</w:t>
+      </w:r>
     </w:p>
     <w:p>
       <w:pPr>
@@ -1583,13 +1067,8 @@
           <w:numId w:val="12"/>
         </w:numPr>
       </w:pPr>
-      <w:proofErr w:type="spellStart"/>
-      <w:r>
-        <w:t>chewr_raw_score</w:t>
-      </w:r>
-      <w:proofErr w:type="spellEnd"/>
-      <w:r>
-        <w:t xml:space="preserve"> is the </w:t>
+      <w:r>
+        <w:t xml:space="preserve">chewr_raw_score is the </w:t>
       </w:r>
       <w:r>
         <w:rPr>
@@ -1610,13 +1089,8 @@
           <w:numId w:val="12"/>
         </w:numPr>
       </w:pPr>
-      <w:proofErr w:type="spellStart"/>
-      <w:r>
-        <w:t>chewr_chewing_efficiency_score</w:t>
-      </w:r>
-      <w:proofErr w:type="spellEnd"/>
-      <w:r>
-        <w:t xml:space="preserve"> is the </w:t>
+      <w:r>
+        <w:t xml:space="preserve">chewr_chewing_efficiency_score is the </w:t>
       </w:r>
       <w:r>
         <w:rPr>
@@ -1693,19 +1167,8 @@
       </w:pPr>
       <w:r>
         <w:lastRenderedPageBreak/>
-        <w:t>9</w:t>
-      </w:r>
-      <w:r>
-        <w:t xml:space="preserve">. </w:t>
-      </w:r>
-      <w:r>
-        <w:t xml:space="preserve">How to cite </w:t>
-      </w:r>
-      <w:proofErr w:type="spellStart"/>
-      <w:r>
-        <w:t>chewR</w:t>
-      </w:r>
-      <w:proofErr w:type="spellEnd"/>
+        <w:t>9. How to cite chewR</w:t>
+      </w:r>
     </w:p>
     <w:p>
       <w:pPr>
@@ -1728,36 +1191,12 @@
           <w:b/>
           <w:bCs/>
         </w:rPr>
-        <w:t xml:space="preserve">If you use </w:t>
-      </w:r>
-      <w:proofErr w:type="spellStart"/>
-      <w:r>
-        <w:rPr>
-          <w:b/>
-          <w:bCs/>
-        </w:rPr>
-        <w:t>chewR</w:t>
-      </w:r>
-      <w:proofErr w:type="spellEnd"/>
-      <w:r>
-        <w:rPr>
-          <w:b/>
-          <w:bCs/>
-        </w:rPr>
-        <w:t xml:space="preserve"> in research, please cite:</w:t>
+        <w:t>If you use chewR in research, please cite:</w:t>
       </w:r>
     </w:p>
     <w:p>
       <w:r>
-        <w:t xml:space="preserve">Long JW (2026). </w:t>
-      </w:r>
-      <w:proofErr w:type="spellStart"/>
-      <w:r>
-        <w:t>chewR</w:t>
-      </w:r>
-      <w:proofErr w:type="spellEnd"/>
-      <w:r>
-        <w:t>: An Open-Source R Package for Quantifying Chewing Efficiency.</w:t>
+        <w:t>Long JW (2026). chewR: An Open-Source R Package for Quantifying Chewing Efficiency.</w:t>
       </w:r>
     </w:p>
     <w:p>
@@ -1810,30 +1249,7 @@
           <w:rFonts w:ascii="Courier New" w:eastAsia="Courier New" w:hAnsi="Courier New"/>
           <w:sz w:val="19"/>
         </w:rPr>
-        <w:t>citation</w:t>
-      </w:r>
-      <w:r>
-        <w:rPr>
-          <w:rFonts w:ascii="Courier New" w:eastAsia="Courier New" w:hAnsi="Courier New"/>
-          <w:sz w:val="19"/>
-        </w:rPr>
-        <w:t>("</w:t>
-      </w:r>
-      <w:proofErr w:type="spellStart"/>
-      <w:r>
-        <w:rPr>
-          <w:rFonts w:ascii="Courier New" w:eastAsia="Courier New" w:hAnsi="Courier New"/>
-          <w:sz w:val="19"/>
-        </w:rPr>
-        <w:t>chewR</w:t>
-      </w:r>
-      <w:proofErr w:type="spellEnd"/>
-      <w:r>
-        <w:rPr>
-          <w:rFonts w:ascii="Courier New" w:eastAsia="Courier New" w:hAnsi="Courier New"/>
-          <w:sz w:val="19"/>
-        </w:rPr>
-        <w:t>")</w:t>
+        <w:t>citation("chewR")</w:t>
       </w:r>
     </w:p>
     <w:sectPr>

</xml_diff>

<commit_message>
updated README and tutorial files
</commit_message>
<xml_diff>
--- a/docs/chewR_tutorial.docx
+++ b/docs/chewR_tutorial.docx
@@ -7,8 +7,13 @@
         <w:pStyle w:val="Title"/>
         <w:jc w:val="center"/>
       </w:pPr>
-      <w:r>
-        <w:t>chewR Quick Start Guide</w:t>
+      <w:proofErr w:type="spellStart"/>
+      <w:r>
+        <w:t>chewR</w:t>
+      </w:r>
+      <w:proofErr w:type="spellEnd"/>
+      <w:r>
+        <w:t xml:space="preserve"> Quick Start Guide</w:t>
       </w:r>
     </w:p>
     <w:p>
@@ -31,7 +36,21 @@
         <w:rPr>
           <w:i/>
         </w:rPr>
-        <w:t xml:space="preserve"> the chewR package</w:t>
+        <w:t xml:space="preserve"> the </w:t>
+      </w:r>
+      <w:proofErr w:type="spellStart"/>
+      <w:r>
+        <w:rPr>
+          <w:i/>
+        </w:rPr>
+        <w:t>chewR</w:t>
+      </w:r>
+      <w:proofErr w:type="spellEnd"/>
+      <w:r>
+        <w:rPr>
+          <w:i/>
+        </w:rPr>
+        <w:t xml:space="preserve"> package</w:t>
       </w:r>
     </w:p>
     <w:p>
@@ -39,12 +58,41 @@
         <w:pStyle w:val="Heading1"/>
       </w:pPr>
       <w:r>
-        <w:t>1. What chewR does</w:t>
+        <w:t xml:space="preserve">1. What </w:t>
+      </w:r>
+      <w:proofErr w:type="spellStart"/>
+      <w:r>
+        <w:t>chewR</w:t>
+      </w:r>
+      <w:proofErr w:type="spellEnd"/>
+      <w:r>
+        <w:t xml:space="preserve"> does</w:t>
       </w:r>
     </w:p>
     <w:p>
-      <w:r>
-        <w:t>chewR is an R package for processing scanned gum images and summarizing chewing efficiency using hue-based image analysis. The main function is run_chewr_pipeline().</w:t>
+      <w:proofErr w:type="spellStart"/>
+      <w:r>
+        <w:t>chewR</w:t>
+      </w:r>
+      <w:proofErr w:type="spellEnd"/>
+      <w:r>
+        <w:t xml:space="preserve"> is an R package for processing scanned gum images and summarizing chewing efficiency using hue-based image analysis. The main function is </w:t>
+      </w:r>
+      <w:proofErr w:type="spellStart"/>
+      <w:r>
+        <w:t>run_chewr_</w:t>
+      </w:r>
+      <w:proofErr w:type="gramStart"/>
+      <w:r>
+        <w:t>pipeline</w:t>
+      </w:r>
+      <w:proofErr w:type="spellEnd"/>
+      <w:r>
+        <w:t>(</w:t>
+      </w:r>
+      <w:proofErr w:type="gramEnd"/>
+      <w:r>
+        <w:t>).</w:t>
       </w:r>
     </w:p>
     <w:p>
@@ -56,8 +104,29 @@
       </w:r>
     </w:p>
     <w:p>
-      <w:r>
-        <w:t>chewR accepts the following file types: .png, .jpg, .jpeg, .tif, and .tiff.</w:t>
+      <w:proofErr w:type="spellStart"/>
+      <w:r>
+        <w:t>chewR</w:t>
+      </w:r>
+      <w:proofErr w:type="spellEnd"/>
+      <w:r>
+        <w:t xml:space="preserve"> accepts the following file types: .</w:t>
+      </w:r>
+      <w:proofErr w:type="spellStart"/>
+      <w:r>
+        <w:t>png</w:t>
+      </w:r>
+      <w:proofErr w:type="spellEnd"/>
+      <w:r>
+        <w:t>, .jpg, .jpeg, .</w:t>
+      </w:r>
+      <w:proofErr w:type="spellStart"/>
+      <w:r>
+        <w:t>tif</w:t>
+      </w:r>
+      <w:proofErr w:type="spellEnd"/>
+      <w:r>
+        <w:t>, and .tiff.</w:t>
       </w:r>
       <w:r>
         <w:t xml:space="preserve"> </w:t>
@@ -79,7 +148,15 @@
         <w:t>Scan all gum images clearly and save them as image files</w:t>
       </w:r>
       <w:r>
-        <w:t xml:space="preserve"> (.png if possible)</w:t>
+        <w:t xml:space="preserve"> (.</w:t>
+      </w:r>
+      <w:proofErr w:type="spellStart"/>
+      <w:r>
+        <w:t>png</w:t>
+      </w:r>
+      <w:proofErr w:type="spellEnd"/>
+      <w:r>
+        <w:t xml:space="preserve"> if possible)</w:t>
       </w:r>
     </w:p>
     <w:p>
@@ -191,7 +268,23 @@
     </w:p>
     <w:p>
       <w:r>
-        <w:t>Rules: ID must be numeric only; side must be side1 or side2; chew count must be numeric.</w:t>
+        <w:t xml:space="preserve">Rules: ID must be numeric only; side must be </w:t>
+      </w:r>
+      <w:proofErr w:type="gramStart"/>
+      <w:r>
+        <w:t>side1</w:t>
+      </w:r>
+      <w:proofErr w:type="gramEnd"/>
+      <w:r>
+        <w:t xml:space="preserve"> or </w:t>
+      </w:r>
+      <w:proofErr w:type="gramStart"/>
+      <w:r>
+        <w:t>side2</w:t>
+      </w:r>
+      <w:proofErr w:type="gramEnd"/>
+      <w:r>
+        <w:t>; chew count must be numeric.</w:t>
       </w:r>
     </w:p>
     <w:p>
@@ -415,33 +508,60 @@
           <w:sz w:val="19"/>
         </w:rPr>
       </w:pPr>
+      <w:proofErr w:type="spellStart"/>
       <w:r>
         <w:rPr>
           <w:rFonts w:ascii="Courier New" w:eastAsia="Courier New" w:hAnsi="Courier New"/>
           <w:sz w:val="19"/>
         </w:rPr>
-        <w:t>setwd("C:/path/to/your/image_folder")</w:t>
-      </w:r>
-    </w:p>
-    <w:p/>
-    <w:p>
-      <w:r>
-        <w:t>You can confirm your working directory by running:</w:t>
-      </w:r>
-    </w:p>
-    <w:p>
-      <w:pPr>
+        <w:t>setwd</w:t>
+      </w:r>
+      <w:proofErr w:type="spellEnd"/>
+      <w:r>
         <w:rPr>
           <w:rFonts w:ascii="Courier New" w:eastAsia="Courier New" w:hAnsi="Courier New"/>
           <w:sz w:val="19"/>
         </w:rPr>
-      </w:pPr>
-      <w:r>
+        <w:t>("C:/path/to/your/image_folder")</w:t>
+      </w:r>
+    </w:p>
+    <w:p/>
+    <w:p>
+      <w:r>
+        <w:t>You can confirm your working directory by running:</w:t>
+      </w:r>
+    </w:p>
+    <w:p>
+      <w:pPr>
         <w:rPr>
           <w:rFonts w:ascii="Courier New" w:eastAsia="Courier New" w:hAnsi="Courier New"/>
           <w:sz w:val="19"/>
         </w:rPr>
-        <w:t>getwd()</w:t>
+      </w:pPr>
+      <w:proofErr w:type="spellStart"/>
+      <w:proofErr w:type="gramStart"/>
+      <w:r>
+        <w:rPr>
+          <w:rFonts w:ascii="Courier New" w:eastAsia="Courier New" w:hAnsi="Courier New"/>
+          <w:sz w:val="19"/>
+        </w:rPr>
+        <w:t>getwd</w:t>
+      </w:r>
+      <w:proofErr w:type="spellEnd"/>
+      <w:r>
+        <w:rPr>
+          <w:rFonts w:ascii="Courier New" w:eastAsia="Courier New" w:hAnsi="Courier New"/>
+          <w:sz w:val="19"/>
+        </w:rPr>
+        <w:t>(</w:t>
+      </w:r>
+      <w:proofErr w:type="gramEnd"/>
+      <w:r>
+        <w:rPr>
+          <w:rFonts w:ascii="Courier New" w:eastAsia="Courier New" w:hAnsi="Courier New"/>
+          <w:sz w:val="19"/>
+        </w:rPr>
+        <w:t>)</w:t>
       </w:r>
     </w:p>
     <w:p>
@@ -488,12 +608,23 @@
       </w:r>
     </w:p>
     <w:p>
+      <w:proofErr w:type="spellStart"/>
+      <w:proofErr w:type="gramStart"/>
       <w:r>
         <w:rPr>
           <w:rFonts w:ascii="Courier New" w:eastAsia="Courier New" w:hAnsi="Courier New"/>
           <w:sz w:val="19"/>
         </w:rPr>
-        <w:t>install.packages(</w:t>
+        <w:t>install.packages</w:t>
+      </w:r>
+      <w:proofErr w:type="spellEnd"/>
+      <w:proofErr w:type="gramEnd"/>
+      <w:r>
+        <w:rPr>
+          <w:rFonts w:ascii="Courier New" w:eastAsia="Courier New" w:hAnsi="Courier New"/>
+          <w:sz w:val="19"/>
+        </w:rPr>
+        <w:t>(</w:t>
       </w:r>
       <w:r>
         <w:rPr>
@@ -502,6 +633,7 @@
         </w:rPr>
         <w:t>"</w:t>
       </w:r>
+      <w:proofErr w:type="spellStart"/>
       <w:r>
         <w:rPr>
           <w:rFonts w:ascii="Courier New" w:eastAsia="Courier New" w:hAnsi="Courier New"/>
@@ -509,6 +641,7 @@
         </w:rPr>
         <w:t>devtools</w:t>
       </w:r>
+      <w:proofErr w:type="spellEnd"/>
       <w:r>
         <w:rPr>
           <w:rFonts w:ascii="Courier New" w:eastAsia="Courier New" w:hAnsi="Courier New"/>
@@ -525,12 +658,39 @@
       </w:r>
     </w:p>
     <w:p>
+      <w:proofErr w:type="spellStart"/>
+      <w:proofErr w:type="gramStart"/>
       <w:r>
         <w:rPr>
           <w:rFonts w:ascii="Courier New" w:eastAsia="Courier New" w:hAnsi="Courier New"/>
           <w:sz w:val="19"/>
         </w:rPr>
-        <w:t>devtools::install_github(</w:t>
+        <w:t>devtools</w:t>
+      </w:r>
+      <w:proofErr w:type="spellEnd"/>
+      <w:r>
+        <w:rPr>
+          <w:rFonts w:ascii="Courier New" w:eastAsia="Courier New" w:hAnsi="Courier New"/>
+          <w:sz w:val="19"/>
+        </w:rPr>
+        <w:t>::</w:t>
+      </w:r>
+      <w:proofErr w:type="spellStart"/>
+      <w:proofErr w:type="gramEnd"/>
+      <w:r>
+        <w:rPr>
+          <w:rFonts w:ascii="Courier New" w:eastAsia="Courier New" w:hAnsi="Courier New"/>
+          <w:sz w:val="19"/>
+        </w:rPr>
+        <w:t>install_github</w:t>
+      </w:r>
+      <w:proofErr w:type="spellEnd"/>
+      <w:r>
+        <w:rPr>
+          <w:rFonts w:ascii="Courier New" w:eastAsia="Courier New" w:hAnsi="Courier New"/>
+          <w:sz w:val="19"/>
+        </w:rPr>
+        <w:t>(</w:t>
       </w:r>
       <w:r>
         <w:rPr>
@@ -539,13 +699,31 @@
         </w:rPr>
         <w:t>"</w:t>
       </w:r>
+      <w:proofErr w:type="spellStart"/>
       <w:r>
         <w:rPr>
           <w:rFonts w:ascii="Courier New" w:eastAsia="Courier New" w:hAnsi="Courier New"/>
           <w:sz w:val="19"/>
         </w:rPr>
-        <w:t>JohnLongPhD/chewR</w:t>
-      </w:r>
+        <w:t>JohnLongPhD</w:t>
+      </w:r>
+      <w:proofErr w:type="spellEnd"/>
+      <w:r>
+        <w:rPr>
+          <w:rFonts w:ascii="Courier New" w:eastAsia="Courier New" w:hAnsi="Courier New"/>
+          <w:sz w:val="19"/>
+        </w:rPr>
+        <w:t>/</w:t>
+      </w:r>
+      <w:proofErr w:type="spellStart"/>
+      <w:r>
+        <w:rPr>
+          <w:rFonts w:ascii="Courier New" w:eastAsia="Courier New" w:hAnsi="Courier New"/>
+          <w:sz w:val="19"/>
+        </w:rPr>
+        <w:t>chewR</w:t>
+      </w:r>
+      <w:proofErr w:type="spellEnd"/>
       <w:r>
         <w:rPr>
           <w:rFonts w:ascii="Courier New" w:eastAsia="Courier New" w:hAnsi="Courier New"/>
@@ -564,7 +742,15 @@
     <w:p/>
     <w:p>
       <w:r>
-        <w:t>If devtools does not install</w:t>
+        <w:t xml:space="preserve">If </w:t>
+      </w:r>
+      <w:proofErr w:type="spellStart"/>
+      <w:r>
+        <w:t>devtools</w:t>
+      </w:r>
+      <w:proofErr w:type="spellEnd"/>
+      <w:r>
+        <w:t xml:space="preserve"> does not install</w:t>
       </w:r>
       <w:r>
         <w:t xml:space="preserve"> from the code above</w:t>
@@ -636,28 +822,100 @@
       <w:pPr>
         <w:rPr>
           <w:rFonts w:ascii="Courier New" w:eastAsia="Courier New" w:hAnsi="Courier New"/>
-          <w:sz w:val="14"/>
-          <w:szCs w:val="14"/>
+          <w:sz w:val="19"/>
         </w:rPr>
       </w:pPr>
-    </w:p>
-    <w:p>
       <w:r>
         <w:rPr>
           <w:rFonts w:ascii="Courier New" w:eastAsia="Courier New" w:hAnsi="Courier New"/>
           <w:sz w:val="19"/>
         </w:rPr>
-        <w:t>library(chewR)</w:t>
-      </w:r>
-    </w:p>
-    <w:p>
+        <w:t>library(</w:t>
+      </w:r>
+      <w:proofErr w:type="spellStart"/>
       <w:r>
         <w:rPr>
           <w:rFonts w:ascii="Courier New" w:eastAsia="Courier New" w:hAnsi="Courier New"/>
           <w:sz w:val="19"/>
         </w:rPr>
-        <w:t>pipeline_results &lt;- run_chewr_pipeline(</w:t>
-      </w:r>
+        <w:t>chewR</w:t>
+      </w:r>
+      <w:proofErr w:type="spellEnd"/>
+      <w:r>
+        <w:rPr>
+          <w:rFonts w:ascii="Courier New" w:eastAsia="Courier New" w:hAnsi="Courier New"/>
+          <w:sz w:val="19"/>
+        </w:rPr>
+        <w:t>)</w:t>
+      </w:r>
+    </w:p>
+    <w:p>
+      <w:r>
+        <w:rPr>
+          <w:rFonts w:ascii="Courier New" w:eastAsia="Courier New" w:hAnsi="Courier New"/>
+          <w:sz w:val="19"/>
+        </w:rPr>
+        <w:t>#</w:t>
+      </w:r>
+      <w:proofErr w:type="gramStart"/>
+      <w:r>
+        <w:rPr>
+          <w:rFonts w:ascii="Courier New" w:eastAsia="Courier New" w:hAnsi="Courier New"/>
+          <w:sz w:val="19"/>
+        </w:rPr>
+        <w:t>set</w:t>
+      </w:r>
+      <w:proofErr w:type="gramEnd"/>
+      <w:r>
+        <w:rPr>
+          <w:rFonts w:ascii="Courier New" w:eastAsia="Courier New" w:hAnsi="Courier New"/>
+          <w:sz w:val="19"/>
+        </w:rPr>
+        <w:t xml:space="preserve"> your working directory to the folder that contains the images</w:t>
+      </w:r>
+    </w:p>
+    <w:p>
+      <w:proofErr w:type="spellStart"/>
+      <w:r>
+        <w:rPr>
+          <w:rFonts w:ascii="Courier New" w:eastAsia="Courier New" w:hAnsi="Courier New"/>
+          <w:sz w:val="19"/>
+        </w:rPr>
+        <w:t>pipeline_results</w:t>
+      </w:r>
+      <w:proofErr w:type="spellEnd"/>
+      <w:r>
+        <w:rPr>
+          <w:rFonts w:ascii="Courier New" w:eastAsia="Courier New" w:hAnsi="Courier New"/>
+          <w:sz w:val="19"/>
+        </w:rPr>
+        <w:t xml:space="preserve"> &lt;- </w:t>
+      </w:r>
+      <w:proofErr w:type="spellStart"/>
+      <w:r>
+        <w:rPr>
+          <w:rFonts w:ascii="Courier New" w:eastAsia="Courier New" w:hAnsi="Courier New"/>
+          <w:sz w:val="19"/>
+        </w:rPr>
+        <w:t>run_chewr_</w:t>
+      </w:r>
+      <w:proofErr w:type="gramStart"/>
+      <w:r>
+        <w:rPr>
+          <w:rFonts w:ascii="Courier New" w:eastAsia="Courier New" w:hAnsi="Courier New"/>
+          <w:sz w:val="19"/>
+        </w:rPr>
+        <w:t>pipeline</w:t>
+      </w:r>
+      <w:proofErr w:type="spellEnd"/>
+      <w:r>
+        <w:rPr>
+          <w:rFonts w:ascii="Courier New" w:eastAsia="Courier New" w:hAnsi="Courier New"/>
+          <w:sz w:val="19"/>
+        </w:rPr>
+        <w:t>(</w:t>
+      </w:r>
+      <w:proofErr w:type="gramEnd"/>
     </w:p>
     <w:p>
       <w:r>
@@ -674,25 +932,23 @@
           <w:rFonts w:ascii="Courier New" w:eastAsia="Courier New" w:hAnsi="Courier New"/>
           <w:sz w:val="19"/>
         </w:rPr>
-        <w:t xml:space="preserve">  output_excel_path    = "chewR_results.xlsx",</w:t>
-      </w:r>
-    </w:p>
-    <w:p>
+        <w:t xml:space="preserve">  </w:t>
+      </w:r>
+      <w:proofErr w:type="spellStart"/>
       <w:r>
         <w:rPr>
           <w:rFonts w:ascii="Courier New" w:eastAsia="Courier New" w:hAnsi="Courier New"/>
           <w:sz w:val="19"/>
         </w:rPr>
-        <w:t xml:space="preserve">  output_plot_dir      = "chewR_plots",</w:t>
-      </w:r>
-    </w:p>
-    <w:p>
+        <w:t>output_excel_path</w:t>
+      </w:r>
+      <w:proofErr w:type="spellEnd"/>
       <w:r>
         <w:rPr>
           <w:rFonts w:ascii="Courier New" w:eastAsia="Courier New" w:hAnsi="Courier New"/>
           <w:sz w:val="19"/>
         </w:rPr>
-        <w:t xml:space="preserve">  auto_crop            = TRUE,</w:t>
+        <w:t xml:space="preserve">    = "chewR_results.xlsx",</w:t>
       </w:r>
     </w:p>
     <w:p>
@@ -701,10 +957,98 @@
           <w:rFonts w:ascii="Courier New" w:eastAsia="Courier New" w:hAnsi="Courier New"/>
           <w:sz w:val="19"/>
         </w:rPr>
-        <w:t xml:space="preserve">  save_analysis_images = TRUE</w:t>
+        <w:t xml:space="preserve">  </w:t>
+      </w:r>
+      <w:proofErr w:type="spellStart"/>
+      <w:r>
+        <w:rPr>
+          <w:rFonts w:ascii="Courier New" w:eastAsia="Courier New" w:hAnsi="Courier New"/>
+          <w:sz w:val="19"/>
+        </w:rPr>
+        <w:t>output_plot_dir</w:t>
+      </w:r>
+      <w:proofErr w:type="spellEnd"/>
+      <w:r>
+        <w:rPr>
+          <w:rFonts w:ascii="Courier New" w:eastAsia="Courier New" w:hAnsi="Courier New"/>
+          <w:sz w:val="19"/>
+        </w:rPr>
+        <w:t xml:space="preserve">      = "</w:t>
+      </w:r>
+      <w:proofErr w:type="spellStart"/>
+      <w:r>
+        <w:rPr>
+          <w:rFonts w:ascii="Courier New" w:eastAsia="Courier New" w:hAnsi="Courier New"/>
+          <w:sz w:val="19"/>
+        </w:rPr>
+        <w:t>chewR_plots</w:t>
+      </w:r>
+      <w:proofErr w:type="spellEnd"/>
+      <w:r>
+        <w:rPr>
+          <w:rFonts w:ascii="Courier New" w:eastAsia="Courier New" w:hAnsi="Courier New"/>
+          <w:sz w:val="19"/>
+        </w:rPr>
+        <w:t>",</w:t>
       </w:r>
     </w:p>
     <w:p>
+      <w:r>
+        <w:rPr>
+          <w:rFonts w:ascii="Courier New" w:eastAsia="Courier New" w:hAnsi="Courier New"/>
+          <w:sz w:val="19"/>
+        </w:rPr>
+        <w:t xml:space="preserve">  </w:t>
+      </w:r>
+      <w:proofErr w:type="spellStart"/>
+      <w:r>
+        <w:rPr>
+          <w:rFonts w:ascii="Courier New" w:eastAsia="Courier New" w:hAnsi="Courier New"/>
+          <w:sz w:val="19"/>
+        </w:rPr>
+        <w:t>auto_crop</w:t>
+      </w:r>
+      <w:proofErr w:type="spellEnd"/>
+      <w:r>
+        <w:rPr>
+          <w:rFonts w:ascii="Courier New" w:eastAsia="Courier New" w:hAnsi="Courier New"/>
+          <w:sz w:val="19"/>
+        </w:rPr>
+        <w:t xml:space="preserve">            = TRUE,</w:t>
+      </w:r>
+    </w:p>
+    <w:p>
+      <w:r>
+        <w:rPr>
+          <w:rFonts w:ascii="Courier New" w:eastAsia="Courier New" w:hAnsi="Courier New"/>
+          <w:sz w:val="19"/>
+        </w:rPr>
+        <w:t xml:space="preserve">  </w:t>
+      </w:r>
+      <w:proofErr w:type="spellStart"/>
+      <w:r>
+        <w:rPr>
+          <w:rFonts w:ascii="Courier New" w:eastAsia="Courier New" w:hAnsi="Courier New"/>
+          <w:sz w:val="19"/>
+        </w:rPr>
+        <w:t>save_analysis_images</w:t>
+      </w:r>
+      <w:proofErr w:type="spellEnd"/>
+      <w:r>
+        <w:rPr>
+          <w:rFonts w:ascii="Courier New" w:eastAsia="Courier New" w:hAnsi="Courier New"/>
+          <w:sz w:val="19"/>
+        </w:rPr>
+        <w:t xml:space="preserve"> = TRUE</w:t>
+      </w:r>
+    </w:p>
+    <w:p>
+      <w:pPr>
+        <w:rPr>
+          <w:rFonts w:ascii="Courier New" w:eastAsia="Courier New" w:hAnsi="Courier New"/>
+          <w:sz w:val="19"/>
+        </w:rPr>
+      </w:pPr>
       <w:r>
         <w:rPr>
           <w:rFonts w:ascii="Courier New" w:eastAsia="Courier New" w:hAnsi="Courier New"/>
@@ -713,8 +1057,106 @@
         <w:t>)</w:t>
       </w:r>
     </w:p>
+    <w:p>
+      <w:r>
+        <w:rPr>
+          <w:rFonts w:ascii="Courier New" w:eastAsia="Courier New" w:hAnsi="Courier New"/>
+          <w:sz w:val="19"/>
+        </w:rPr>
+        <w:t>#</w:t>
+      </w:r>
+      <w:proofErr w:type="gramStart"/>
+      <w:r>
+        <w:rPr>
+          <w:rFonts w:ascii="Courier New" w:eastAsia="Courier New" w:hAnsi="Courier New"/>
+          <w:sz w:val="19"/>
+        </w:rPr>
+        <w:t>see</w:t>
+      </w:r>
+      <w:proofErr w:type="gramEnd"/>
+      <w:r>
+        <w:rPr>
+          <w:rFonts w:ascii="Courier New" w:eastAsia="Courier New" w:hAnsi="Courier New"/>
+          <w:sz w:val="19"/>
+        </w:rPr>
+        <w:t xml:space="preserve"> the excel file in your working directory for the chewing efficiency variables</w:t>
+      </w:r>
+    </w:p>
+    <w:p/>
     <w:p/>
     <w:p>
+      <w:pPr>
+        <w:rPr>
+          <w:b/>
+          <w:bCs/>
+        </w:rPr>
+      </w:pPr>
+      <w:r>
+        <w:rPr>
+          <w:b/>
+          <w:bCs/>
+        </w:rPr>
+        <w:t>If your filenames use the fixed format:</w:t>
+      </w:r>
+    </w:p>
+    <w:p>
+      <w:pPr>
+        <w:rPr>
+          <w:rFonts w:ascii="Courier New" w:eastAsia="Courier New" w:hAnsi="Courier New"/>
+          <w:sz w:val="19"/>
+        </w:rPr>
+      </w:pPr>
+      <w:r>
+        <w:rPr>
+          <w:rFonts w:ascii="Courier New" w:eastAsia="Courier New" w:hAnsi="Courier New"/>
+          <w:sz w:val="19"/>
+        </w:rPr>
+        <w:t>library(</w:t>
+      </w:r>
+      <w:proofErr w:type="spellStart"/>
+      <w:r>
+        <w:rPr>
+          <w:rFonts w:ascii="Courier New" w:eastAsia="Courier New" w:hAnsi="Courier New"/>
+          <w:sz w:val="19"/>
+        </w:rPr>
+        <w:t>chewR</w:t>
+      </w:r>
+      <w:proofErr w:type="spellEnd"/>
+      <w:r>
+        <w:rPr>
+          <w:rFonts w:ascii="Courier New" w:eastAsia="Courier New" w:hAnsi="Courier New"/>
+          <w:sz w:val="19"/>
+        </w:rPr>
+        <w:t>)</w:t>
+      </w:r>
+    </w:p>
+    <w:p>
+      <w:r>
+        <w:rPr>
+          <w:rFonts w:ascii="Courier New" w:eastAsia="Courier New" w:hAnsi="Courier New"/>
+          <w:sz w:val="19"/>
+        </w:rPr>
+        <w:t>#</w:t>
+      </w:r>
+      <w:proofErr w:type="gramStart"/>
+      <w:r>
+        <w:rPr>
+          <w:rFonts w:ascii="Courier New" w:eastAsia="Courier New" w:hAnsi="Courier New"/>
+          <w:sz w:val="19"/>
+        </w:rPr>
+        <w:t>set</w:t>
+      </w:r>
+      <w:proofErr w:type="gramEnd"/>
+      <w:r>
+        <w:rPr>
+          <w:rFonts w:ascii="Courier New" w:eastAsia="Courier New" w:hAnsi="Courier New"/>
+          <w:sz w:val="19"/>
+        </w:rPr>
+        <w:t xml:space="preserve"> your working directory to the folder that contains the images</w:t>
+      </w:r>
+    </w:p>
+    <w:p>
+      <w:proofErr w:type="spellStart"/>
       <w:r>
         <w:rPr>
           <w:rFonts w:ascii="Courier New" w:eastAsia="Courier New" w:hAnsi="Courier New"/>
@@ -722,48 +1164,39 @@
         </w:rPr>
         <w:t>pipeline_results</w:t>
       </w:r>
-    </w:p>
-    <w:p/>
-    <w:p>
-      <w:pPr>
-        <w:rPr>
-          <w:b/>
-          <w:bCs/>
-        </w:rPr>
-      </w:pPr>
-      <w:r>
-        <w:rPr>
-          <w:b/>
-          <w:bCs/>
-        </w:rPr>
-        <w:t>If your filenames use the fixed format:</w:t>
-      </w:r>
-    </w:p>
-    <w:p>
-      <w:pPr>
+      <w:proofErr w:type="spellEnd"/>
+      <w:r>
         <w:rPr>
           <w:rFonts w:ascii="Courier New" w:eastAsia="Courier New" w:hAnsi="Courier New"/>
           <w:sz w:val="19"/>
         </w:rPr>
-      </w:pPr>
-    </w:p>
-    <w:p>
+        <w:t xml:space="preserve"> &lt;- </w:t>
+      </w:r>
+      <w:proofErr w:type="spellStart"/>
       <w:r>
         <w:rPr>
           <w:rFonts w:ascii="Courier New" w:eastAsia="Courier New" w:hAnsi="Courier New"/>
           <w:sz w:val="19"/>
         </w:rPr>
-        <w:t>library(chewR)</w:t>
-      </w:r>
-    </w:p>
-    <w:p>
+        <w:t>run_chewr_</w:t>
+      </w:r>
+      <w:proofErr w:type="gramStart"/>
       <w:r>
         <w:rPr>
           <w:rFonts w:ascii="Courier New" w:eastAsia="Courier New" w:hAnsi="Courier New"/>
           <w:sz w:val="19"/>
         </w:rPr>
-        <w:t>pipeline_results &lt;- run_chewr_pipeline(</w:t>
-      </w:r>
+        <w:t>pipeline</w:t>
+      </w:r>
+      <w:proofErr w:type="spellEnd"/>
+      <w:r>
+        <w:rPr>
+          <w:rFonts w:ascii="Courier New" w:eastAsia="Courier New" w:hAnsi="Courier New"/>
+          <w:sz w:val="19"/>
+        </w:rPr>
+        <w:t>(</w:t>
+      </w:r>
+      <w:proofErr w:type="gramEnd"/>
     </w:p>
     <w:p>
       <w:r>
@@ -780,25 +1213,23 @@
           <w:rFonts w:ascii="Courier New" w:eastAsia="Courier New" w:hAnsi="Courier New"/>
           <w:sz w:val="19"/>
         </w:rPr>
-        <w:t xml:space="preserve">  output_excel_path    = "chewR_results.xlsx",</w:t>
-      </w:r>
-    </w:p>
-    <w:p>
+        <w:t xml:space="preserve">  </w:t>
+      </w:r>
+      <w:proofErr w:type="spellStart"/>
       <w:r>
         <w:rPr>
           <w:rFonts w:ascii="Courier New" w:eastAsia="Courier New" w:hAnsi="Courier New"/>
           <w:sz w:val="19"/>
         </w:rPr>
-        <w:t xml:space="preserve">  output_plot_dir      = "chewR_plots",</w:t>
-      </w:r>
-    </w:p>
-    <w:p>
+        <w:t>output_excel_path</w:t>
+      </w:r>
+      <w:proofErr w:type="spellEnd"/>
       <w:r>
         <w:rPr>
           <w:rFonts w:ascii="Courier New" w:eastAsia="Courier New" w:hAnsi="Courier New"/>
           <w:sz w:val="19"/>
         </w:rPr>
-        <w:t xml:space="preserve">  auto_crop            = TRUE,</w:t>
+        <w:t xml:space="preserve">    = "chewR_results.xlsx",</w:t>
       </w:r>
     </w:p>
     <w:p>
@@ -807,7 +1238,89 @@
           <w:rFonts w:ascii="Courier New" w:eastAsia="Courier New" w:hAnsi="Courier New"/>
           <w:sz w:val="19"/>
         </w:rPr>
-        <w:t xml:space="preserve">  save_analysis_images = TRUE</w:t>
+        <w:t xml:space="preserve">  </w:t>
+      </w:r>
+      <w:proofErr w:type="spellStart"/>
+      <w:r>
+        <w:rPr>
+          <w:rFonts w:ascii="Courier New" w:eastAsia="Courier New" w:hAnsi="Courier New"/>
+          <w:sz w:val="19"/>
+        </w:rPr>
+        <w:t>output_plot_dir</w:t>
+      </w:r>
+      <w:proofErr w:type="spellEnd"/>
+      <w:r>
+        <w:rPr>
+          <w:rFonts w:ascii="Courier New" w:eastAsia="Courier New" w:hAnsi="Courier New"/>
+          <w:sz w:val="19"/>
+        </w:rPr>
+        <w:t xml:space="preserve">      = "</w:t>
+      </w:r>
+      <w:proofErr w:type="spellStart"/>
+      <w:r>
+        <w:rPr>
+          <w:rFonts w:ascii="Courier New" w:eastAsia="Courier New" w:hAnsi="Courier New"/>
+          <w:sz w:val="19"/>
+        </w:rPr>
+        <w:t>chewR_plots</w:t>
+      </w:r>
+      <w:proofErr w:type="spellEnd"/>
+      <w:r>
+        <w:rPr>
+          <w:rFonts w:ascii="Courier New" w:eastAsia="Courier New" w:hAnsi="Courier New"/>
+          <w:sz w:val="19"/>
+        </w:rPr>
+        <w:t>",</w:t>
+      </w:r>
+    </w:p>
+    <w:p>
+      <w:r>
+        <w:rPr>
+          <w:rFonts w:ascii="Courier New" w:eastAsia="Courier New" w:hAnsi="Courier New"/>
+          <w:sz w:val="19"/>
+        </w:rPr>
+        <w:t xml:space="preserve">  </w:t>
+      </w:r>
+      <w:proofErr w:type="spellStart"/>
+      <w:r>
+        <w:rPr>
+          <w:rFonts w:ascii="Courier New" w:eastAsia="Courier New" w:hAnsi="Courier New"/>
+          <w:sz w:val="19"/>
+        </w:rPr>
+        <w:t>auto_crop</w:t>
+      </w:r>
+      <w:proofErr w:type="spellEnd"/>
+      <w:r>
+        <w:rPr>
+          <w:rFonts w:ascii="Courier New" w:eastAsia="Courier New" w:hAnsi="Courier New"/>
+          <w:sz w:val="19"/>
+        </w:rPr>
+        <w:t xml:space="preserve">            = TRUE,</w:t>
+      </w:r>
+    </w:p>
+    <w:p>
+      <w:r>
+        <w:rPr>
+          <w:rFonts w:ascii="Courier New" w:eastAsia="Courier New" w:hAnsi="Courier New"/>
+          <w:sz w:val="19"/>
+        </w:rPr>
+        <w:t xml:space="preserve">  </w:t>
+      </w:r>
+      <w:proofErr w:type="spellStart"/>
+      <w:r>
+        <w:rPr>
+          <w:rFonts w:ascii="Courier New" w:eastAsia="Courier New" w:hAnsi="Courier New"/>
+          <w:sz w:val="19"/>
+        </w:rPr>
+        <w:t>save_analysis_images</w:t>
+      </w:r>
+      <w:proofErr w:type="spellEnd"/>
+      <w:r>
+        <w:rPr>
+          <w:rFonts w:ascii="Courier New" w:eastAsia="Courier New" w:hAnsi="Courier New"/>
+          <w:sz w:val="19"/>
+        </w:rPr>
+        <w:t xml:space="preserve"> = TRUE</w:t>
       </w:r>
     </w:p>
     <w:p>
@@ -825,23 +1338,105 @@
         <w:t>)</w:t>
       </w:r>
     </w:p>
-    <w:p/>
-    <w:p/>
-    <w:p/>
-    <w:p/>
-    <w:p/>
-    <w:p/>
-    <w:p/>
     <w:p>
       <w:r>
+        <w:rPr>
+          <w:rFonts w:ascii="Courier New" w:eastAsia="Courier New" w:hAnsi="Courier New"/>
+          <w:sz w:val="19"/>
+        </w:rPr>
+        <w:t>#</w:t>
+      </w:r>
+      <w:proofErr w:type="gramStart"/>
+      <w:r>
+        <w:rPr>
+          <w:rFonts w:ascii="Courier New" w:eastAsia="Courier New" w:hAnsi="Courier New"/>
+          <w:sz w:val="19"/>
+        </w:rPr>
+        <w:t>see</w:t>
+      </w:r>
+      <w:proofErr w:type="gramEnd"/>
+      <w:r>
+        <w:rPr>
+          <w:rFonts w:ascii="Courier New" w:eastAsia="Courier New" w:hAnsi="Courier New"/>
+          <w:sz w:val="19"/>
+        </w:rPr>
+        <w:t xml:space="preserve"> the excel file in your working directory for the chewing efficiency variables</w:t>
+      </w:r>
+    </w:p>
+    <w:p>
+      <w:pPr>
+        <w:rPr>
+          <w:rFonts w:ascii="Courier New" w:eastAsia="Courier New" w:hAnsi="Courier New"/>
+          <w:sz w:val="19"/>
+        </w:rPr>
+      </w:pPr>
+    </w:p>
+    <w:p>
+      <w:pPr>
+        <w:rPr>
+          <w:rFonts w:ascii="Courier New" w:eastAsia="Courier New" w:hAnsi="Courier New"/>
+          <w:sz w:val="19"/>
+        </w:rPr>
+      </w:pPr>
+    </w:p>
+    <w:p>
+      <w:pPr>
+        <w:rPr>
+          <w:rFonts w:ascii="Courier New" w:eastAsia="Courier New" w:hAnsi="Courier New"/>
+          <w:sz w:val="19"/>
+        </w:rPr>
+      </w:pPr>
+    </w:p>
+    <w:p>
+      <w:pPr>
+        <w:rPr>
+          <w:rFonts w:ascii="Courier New" w:eastAsia="Courier New" w:hAnsi="Courier New"/>
+          <w:sz w:val="19"/>
+        </w:rPr>
+      </w:pPr>
+    </w:p>
+    <w:p>
+      <w:pPr>
+        <w:rPr>
+          <w:rFonts w:ascii="Courier New" w:eastAsia="Courier New" w:hAnsi="Courier New"/>
+          <w:sz w:val="19"/>
+        </w:rPr>
+      </w:pPr>
+    </w:p>
+    <w:p>
+      <w:pPr>
+        <w:rPr>
+          <w:rFonts w:ascii="Courier New" w:eastAsia="Courier New" w:hAnsi="Courier New"/>
+          <w:sz w:val="19"/>
+        </w:rPr>
+      </w:pPr>
+    </w:p>
+    <w:p>
+      <w:pPr>
+        <w:rPr>
+          <w:rFonts w:ascii="Courier New" w:eastAsia="Courier New" w:hAnsi="Courier New"/>
+          <w:sz w:val="19"/>
+        </w:rPr>
+      </w:pPr>
+    </w:p>
+    <w:p>
+      <w:r>
         <w:lastRenderedPageBreak/>
-        <w:t>In both formats, run the run_c</w:t>
+        <w:t xml:space="preserve">In both formats, run the </w:t>
+      </w:r>
+      <w:proofErr w:type="spellStart"/>
+      <w:r>
+        <w:t>run_c</w:t>
       </w:r>
       <w:r>
         <w:t>h</w:t>
       </w:r>
       <w:r>
-        <w:t>ewr_pipeline and these are the various modifications:</w:t>
+        <w:t>ewr_pipeline</w:t>
+      </w:r>
+      <w:proofErr w:type="spellEnd"/>
+      <w:r>
+        <w:t xml:space="preserve"> and these are the various modifications:</w:t>
       </w:r>
     </w:p>
     <w:p>
@@ -888,8 +1483,21 @@
           <w:numId w:val="10"/>
         </w:numPr>
       </w:pPr>
-      <w:r>
-        <w:t>output_excel_path = the name of your excel spreadsheet that is generated once all your images have been analyzed</w:t>
+      <w:proofErr w:type="spellStart"/>
+      <w:r>
+        <w:t>output_excel_path</w:t>
+      </w:r>
+      <w:proofErr w:type="spellEnd"/>
+      <w:r>
+        <w:t xml:space="preserve"> = the name of </w:t>
+      </w:r>
+      <w:proofErr w:type="gramStart"/>
+      <w:r>
+        <w:t>your</w:t>
+      </w:r>
+      <w:proofErr w:type="gramEnd"/>
+      <w:r>
+        <w:t xml:space="preserve"> excel spreadsheet that is generated once all your images have been analyzed</w:t>
       </w:r>
     </w:p>
     <w:p>
@@ -900,8 +1508,13 @@
           <w:numId w:val="10"/>
         </w:numPr>
       </w:pPr>
-      <w:r>
-        <w:t xml:space="preserve">output_plot_dir = the name of the folder that will contain the images used in the analysis </w:t>
+      <w:proofErr w:type="spellStart"/>
+      <w:r>
+        <w:t>output_plot_dir</w:t>
+      </w:r>
+      <w:proofErr w:type="spellEnd"/>
+      <w:r>
+        <w:t xml:space="preserve"> = the name of the folder that will contain the images used in the analysis </w:t>
       </w:r>
     </w:p>
     <w:p>
@@ -912,11 +1525,16 @@
           <w:numId w:val="10"/>
         </w:numPr>
       </w:pPr>
+      <w:proofErr w:type="spellStart"/>
       <w:r>
         <w:t>a</w:t>
       </w:r>
       <w:r>
-        <w:t>uto_crop = “TRUE” or “FALSE”</w:t>
+        <w:t>uto_crop</w:t>
+      </w:r>
+      <w:proofErr w:type="spellEnd"/>
+      <w:r>
+        <w:t xml:space="preserve"> = “TRUE” or “FALSE”</w:t>
       </w:r>
     </w:p>
     <w:p>
@@ -951,8 +1569,13 @@
           <w:numId w:val="10"/>
         </w:numPr>
       </w:pPr>
-      <w:r>
-        <w:t>save_analysis_images = “TRUE” or “FALSE”</w:t>
+      <w:proofErr w:type="spellStart"/>
+      <w:r>
+        <w:t>save_analysis_images</w:t>
+      </w:r>
+      <w:proofErr w:type="spellEnd"/>
+      <w:r>
+        <w:t xml:space="preserve"> = “TRUE” or “FALSE”</w:t>
       </w:r>
     </w:p>
     <w:p>
@@ -1000,15 +1623,28 @@
         <w:pStyle w:val="ListBullet"/>
       </w:pPr>
       <w:r>
-        <w:t>An output folder, usually named chewR_plots</w:t>
-      </w:r>
+        <w:t xml:space="preserve">An output folder, usually named </w:t>
+      </w:r>
+      <w:proofErr w:type="spellStart"/>
+      <w:r>
+        <w:t>chewR_plots</w:t>
+      </w:r>
+      <w:proofErr w:type="spellEnd"/>
     </w:p>
     <w:p>
       <w:pPr>
         <w:pStyle w:val="ListBullet"/>
       </w:pPr>
       <w:r>
-        <w:t>A subfolder of cropped analysis images if save_analysis_images = TRUE</w:t>
+        <w:t xml:space="preserve">A subfolder of cropped analysis images if </w:t>
+      </w:r>
+      <w:proofErr w:type="spellStart"/>
+      <w:r>
+        <w:t>save_analysis_images</w:t>
+      </w:r>
+      <w:proofErr w:type="spellEnd"/>
+      <w:r>
+        <w:t xml:space="preserve"> = TRUE</w:t>
       </w:r>
     </w:p>
     <w:p>
@@ -1032,8 +1668,13 @@
           <w:numId w:val="14"/>
         </w:numPr>
       </w:pPr>
-      <w:r>
-        <w:t>summary_sides_combined: pooled result across both sides</w:t>
+      <w:proofErr w:type="spellStart"/>
+      <w:r>
+        <w:t>summary_sides_combined</w:t>
+      </w:r>
+      <w:proofErr w:type="spellEnd"/>
+      <w:r>
+        <w:t>: pooled result across both sides</w:t>
       </w:r>
     </w:p>
     <w:p>
@@ -1044,20 +1685,46 @@
           <w:numId w:val="13"/>
         </w:numPr>
       </w:pPr>
-      <w:r>
-        <w:t>summary_by_side: side-specific result</w:t>
+      <w:proofErr w:type="spellStart"/>
+      <w:r>
+        <w:t>summary_by_side</w:t>
+      </w:r>
+      <w:proofErr w:type="spellEnd"/>
+      <w:r>
+        <w:t>: side-specific result</w:t>
       </w:r>
     </w:p>
     <w:p>
       <w:r>
-        <w:t>Use the summary_sides_combined data for analyses.</w:t>
+        <w:t xml:space="preserve">Use the </w:t>
+      </w:r>
+      <w:proofErr w:type="spellStart"/>
+      <w:r>
+        <w:t>summary_sides_combined</w:t>
+      </w:r>
+      <w:proofErr w:type="spellEnd"/>
+      <w:r>
+        <w:t xml:space="preserve"> data for analyses.</w:t>
       </w:r>
     </w:p>
     <w:p/>
     <w:p>
       <w:r>
-        <w:t>You should also see score columns including chewr_raw_score and chewr_chewing_efficiency_score</w:t>
-      </w:r>
+        <w:t xml:space="preserve">You should also see score columns including </w:t>
+      </w:r>
+      <w:proofErr w:type="spellStart"/>
+      <w:r>
+        <w:t>chewr_raw_score</w:t>
+      </w:r>
+      <w:proofErr w:type="spellEnd"/>
+      <w:r>
+        <w:t xml:space="preserve"> and </w:t>
+      </w:r>
+      <w:proofErr w:type="spellStart"/>
+      <w:r>
+        <w:t>chewr_chewing_efficiency_score</w:t>
+      </w:r>
+      <w:proofErr w:type="spellEnd"/>
     </w:p>
     <w:p>
       <w:pPr>
@@ -1067,8 +1734,13 @@
           <w:numId w:val="12"/>
         </w:numPr>
       </w:pPr>
-      <w:r>
-        <w:t xml:space="preserve">chewr_raw_score is the </w:t>
+      <w:proofErr w:type="spellStart"/>
+      <w:r>
+        <w:t>chewr_raw_score</w:t>
+      </w:r>
+      <w:proofErr w:type="spellEnd"/>
+      <w:r>
+        <w:t xml:space="preserve"> is the </w:t>
       </w:r>
       <w:r>
         <w:rPr>
@@ -1089,8 +1761,13 @@
           <w:numId w:val="12"/>
         </w:numPr>
       </w:pPr>
-      <w:r>
-        <w:t xml:space="preserve">chewr_chewing_efficiency_score is the </w:t>
+      <w:proofErr w:type="spellStart"/>
+      <w:r>
+        <w:t>chewr_chewing_efficiency_score</w:t>
+      </w:r>
+      <w:proofErr w:type="spellEnd"/>
+      <w:r>
+        <w:t xml:space="preserve"> is the </w:t>
       </w:r>
       <w:r>
         <w:rPr>
@@ -1136,6 +1813,19 @@
     </w:p>
     <w:p>
       <w:pPr>
+        <w:pStyle w:val="Heading1"/>
+      </w:pPr>
+      <w:r>
+        <w:t xml:space="preserve">9. How to cite </w:t>
+      </w:r>
+      <w:proofErr w:type="spellStart"/>
+      <w:r>
+        <w:t>chewR</w:t>
+      </w:r>
+      <w:proofErr w:type="spellEnd"/>
+    </w:p>
+    <w:p>
+      <w:pPr>
         <w:rPr>
           <w:b/>
           <w:bCs/>
@@ -1148,55 +1838,43 @@
         <w:rPr>
           <w:b/>
           <w:bCs/>
-          <w:color w:val="EE0000"/>
         </w:rPr>
       </w:pPr>
-    </w:p>
-    <w:p>
-      <w:pPr>
-        <w:rPr>
-          <w:b/>
-          <w:bCs/>
-          <w:color w:val="EE0000"/>
-        </w:rPr>
-      </w:pPr>
-    </w:p>
-    <w:p>
-      <w:pPr>
-        <w:pStyle w:val="Heading1"/>
-      </w:pPr>
-      <w:r>
-        <w:lastRenderedPageBreak/>
-        <w:t>9. How to cite chewR</w:t>
-      </w:r>
-    </w:p>
-    <w:p>
-      <w:pPr>
-        <w:rPr>
-          <w:b/>
-          <w:bCs/>
-          <w:color w:val="EE0000"/>
-        </w:rPr>
-      </w:pPr>
-    </w:p>
-    <w:p>
-      <w:pPr>
+      <w:r>
         <w:rPr>
           <w:b/>
           <w:bCs/>
         </w:rPr>
-      </w:pPr>
+        <w:t xml:space="preserve">If you use </w:t>
+      </w:r>
+      <w:proofErr w:type="spellStart"/>
       <w:r>
         <w:rPr>
           <w:b/>
           <w:bCs/>
         </w:rPr>
-        <w:t>If you use chewR in research, please cite:</w:t>
+        <w:t>chewR</w:t>
+      </w:r>
+      <w:proofErr w:type="spellEnd"/>
+      <w:r>
+        <w:rPr>
+          <w:b/>
+          <w:bCs/>
+        </w:rPr>
+        <w:t xml:space="preserve"> in research, please cite:</w:t>
       </w:r>
     </w:p>
     <w:p>
       <w:r>
-        <w:t>Long JW (2026). chewR: An Open-Source R Package for Quantifying Chewing Efficiency.</w:t>
+        <w:t xml:space="preserve">Long JW (2026). </w:t>
+      </w:r>
+      <w:proofErr w:type="spellStart"/>
+      <w:r>
+        <w:t>chewR</w:t>
+      </w:r>
+      <w:proofErr w:type="spellEnd"/>
+      <w:r>
+        <w:t>: An Open-Source R Package for Quantifying Chewing Efficiency.</w:t>
       </w:r>
     </w:p>
     <w:p>
@@ -1209,6 +1887,7 @@
         <w:rPr>
           <w:lang w:val="de-DE"/>
         </w:rPr>
+        <w:lastRenderedPageBreak/>
         <w:t>R package version 0.0.1.</w:t>
       </w:r>
     </w:p>
@@ -1249,7 +1928,23 @@
           <w:rFonts w:ascii="Courier New" w:eastAsia="Courier New" w:hAnsi="Courier New"/>
           <w:sz w:val="19"/>
         </w:rPr>
-        <w:t>citation("chewR")</w:t>
+        <w:t>citation("</w:t>
+      </w:r>
+      <w:proofErr w:type="spellStart"/>
+      <w:r>
+        <w:rPr>
+          <w:rFonts w:ascii="Courier New" w:eastAsia="Courier New" w:hAnsi="Courier New"/>
+          <w:sz w:val="19"/>
+        </w:rPr>
+        <w:t>chewR</w:t>
+      </w:r>
+      <w:proofErr w:type="spellEnd"/>
+      <w:r>
+        <w:rPr>
+          <w:rFonts w:ascii="Courier New" w:eastAsia="Courier New" w:hAnsi="Courier New"/>
+          <w:sz w:val="19"/>
+        </w:rPr>
+        <w:t>")</w:t>
       </w:r>
     </w:p>
     <w:sectPr>

</xml_diff>

<commit_message>
Update terminology from chewing efficiency to masticatory performance
</commit_message>
<xml_diff>
--- a/docs/chewR_tutorial.docx
+++ b/docs/chewR_tutorial.docx
@@ -7,13 +7,8 @@
         <w:pStyle w:val="Title"/>
         <w:jc w:val="center"/>
       </w:pPr>
-      <w:proofErr w:type="spellStart"/>
-      <w:r>
-        <w:t>chewR</w:t>
-      </w:r>
-      <w:proofErr w:type="spellEnd"/>
-      <w:r>
-        <w:t xml:space="preserve"> Quick Start Guide</w:t>
+      <w:r>
+        <w:t>chewR Quick Start Guide</w:t>
       </w:r>
     </w:p>
     <w:p>
@@ -36,21 +31,7 @@
         <w:rPr>
           <w:i/>
         </w:rPr>
-        <w:t xml:space="preserve"> the </w:t>
-      </w:r>
-      <w:proofErr w:type="spellStart"/>
-      <w:r>
-        <w:rPr>
-          <w:i/>
-        </w:rPr>
-        <w:t>chewR</w:t>
-      </w:r>
-      <w:proofErr w:type="spellEnd"/>
-      <w:r>
-        <w:rPr>
-          <w:i/>
-        </w:rPr>
-        <w:t xml:space="preserve"> package</w:t>
+        <w:t xml:space="preserve"> the chewR package</w:t>
       </w:r>
     </w:p>
     <w:p>
@@ -58,41 +39,18 @@
         <w:pStyle w:val="Heading1"/>
       </w:pPr>
       <w:r>
-        <w:t xml:space="preserve">1. What </w:t>
-      </w:r>
-      <w:proofErr w:type="spellStart"/>
-      <w:r>
-        <w:t>chewR</w:t>
-      </w:r>
-      <w:proofErr w:type="spellEnd"/>
-      <w:r>
-        <w:t xml:space="preserve"> does</w:t>
+        <w:t>1. What chewR does</w:t>
       </w:r>
     </w:p>
     <w:p>
-      <w:proofErr w:type="spellStart"/>
-      <w:r>
-        <w:t>chewR</w:t>
-      </w:r>
-      <w:proofErr w:type="spellEnd"/>
-      <w:r>
-        <w:t xml:space="preserve"> is an R package for processing scanned gum images and summarizing chewing efficiency using hue-based image analysis. The main function is </w:t>
-      </w:r>
-      <w:proofErr w:type="spellStart"/>
-      <w:r>
-        <w:t>run_chewr_</w:t>
-      </w:r>
-      <w:proofErr w:type="gramStart"/>
-      <w:r>
-        <w:t>pipeline</w:t>
-      </w:r>
-      <w:proofErr w:type="spellEnd"/>
-      <w:r>
-        <w:t>(</w:t>
-      </w:r>
-      <w:proofErr w:type="gramEnd"/>
-      <w:r>
-        <w:t>).</w:t>
+      <w:r>
+        <w:t xml:space="preserve">chewR is an R package for processing scanned gum images and summarizing </w:t>
+      </w:r>
+      <w:r>
+        <w:t>masticatory performance</w:t>
+      </w:r>
+      <w:r>
+        <w:t xml:space="preserve"> using hue-based image analysis. The main function is run_chewr_pipeline().</w:t>
       </w:r>
     </w:p>
     <w:p>
@@ -104,29 +62,8 @@
       </w:r>
     </w:p>
     <w:p>
-      <w:proofErr w:type="spellStart"/>
-      <w:r>
-        <w:t>chewR</w:t>
-      </w:r>
-      <w:proofErr w:type="spellEnd"/>
-      <w:r>
-        <w:t xml:space="preserve"> accepts the following file types: .</w:t>
-      </w:r>
-      <w:proofErr w:type="spellStart"/>
-      <w:r>
-        <w:t>png</w:t>
-      </w:r>
-      <w:proofErr w:type="spellEnd"/>
-      <w:r>
-        <w:t>, .jpg, .jpeg, .</w:t>
-      </w:r>
-      <w:proofErr w:type="spellStart"/>
-      <w:r>
-        <w:t>tif</w:t>
-      </w:r>
-      <w:proofErr w:type="spellEnd"/>
-      <w:r>
-        <w:t>, and .tiff.</w:t>
+      <w:r>
+        <w:t>chewR accepts the following file types: .png, .jpg, .jpeg, .tif, and .tiff.</w:t>
       </w:r>
       <w:r>
         <w:t xml:space="preserve"> </w:t>
@@ -148,15 +85,7 @@
         <w:t>Scan all gum images clearly and save them as image files</w:t>
       </w:r>
       <w:r>
-        <w:t xml:space="preserve"> (.</w:t>
-      </w:r>
-      <w:proofErr w:type="spellStart"/>
-      <w:r>
-        <w:t>png</w:t>
-      </w:r>
-      <w:proofErr w:type="spellEnd"/>
-      <w:r>
-        <w:t xml:space="preserve"> if possible)</w:t>
+        <w:t xml:space="preserve"> (.png if possible)</w:t>
       </w:r>
     </w:p>
     <w:p>
@@ -268,23 +197,7 @@
     </w:p>
     <w:p>
       <w:r>
-        <w:t xml:space="preserve">Rules: ID must be numeric only; side must be </w:t>
-      </w:r>
-      <w:proofErr w:type="gramStart"/>
-      <w:r>
-        <w:t>side1</w:t>
-      </w:r>
-      <w:proofErr w:type="gramEnd"/>
-      <w:r>
-        <w:t xml:space="preserve"> or </w:t>
-      </w:r>
-      <w:proofErr w:type="gramStart"/>
-      <w:r>
-        <w:t>side2</w:t>
-      </w:r>
-      <w:proofErr w:type="gramEnd"/>
-      <w:r>
-        <w:t>; chew count must be numeric.</w:t>
+        <w:t>Rules: ID must be numeric only; side must be side1 or side2; chew count must be numeric.</w:t>
       </w:r>
     </w:p>
     <w:p>
@@ -508,54 +421,107 @@
           <w:sz w:val="19"/>
         </w:rPr>
       </w:pPr>
-      <w:proofErr w:type="spellStart"/>
       <w:r>
         <w:rPr>
           <w:rFonts w:ascii="Courier New" w:eastAsia="Courier New" w:hAnsi="Courier New"/>
           <w:sz w:val="19"/>
         </w:rPr>
-        <w:t>setwd</w:t>
-      </w:r>
-      <w:proofErr w:type="spellEnd"/>
-      <w:r>
+        <w:t>setwd("C:/path/to/your/image_folder")</w:t>
+      </w:r>
+    </w:p>
+    <w:p/>
+    <w:p>
+      <w:r>
+        <w:t>You can confirm your working directory by running:</w:t>
+      </w:r>
+    </w:p>
+    <w:p>
+      <w:pPr>
         <w:rPr>
           <w:rFonts w:ascii="Courier New" w:eastAsia="Courier New" w:hAnsi="Courier New"/>
           <w:sz w:val="19"/>
         </w:rPr>
-        <w:t>("C:/path/to/your/image_folder")</w:t>
-      </w:r>
-    </w:p>
-    <w:p/>
-    <w:p>
-      <w:r>
-        <w:t>You can confirm your working directory by running:</w:t>
-      </w:r>
-    </w:p>
-    <w:p>
-      <w:pPr>
+      </w:pPr>
+      <w:r>
         <w:rPr>
           <w:rFonts w:ascii="Courier New" w:eastAsia="Courier New" w:hAnsi="Courier New"/>
           <w:sz w:val="19"/>
         </w:rPr>
-      </w:pPr>
-      <w:proofErr w:type="spellStart"/>
-      <w:proofErr w:type="gramStart"/>
+        <w:t>getwd()</w:t>
+      </w:r>
+    </w:p>
+    <w:p>
+      <w:pPr>
+        <w:pStyle w:val="Heading1"/>
+      </w:pPr>
+      <w:r>
+        <w:t xml:space="preserve">6. </w:t>
+      </w:r>
+      <w:r>
+        <w:t>Install, l</w:t>
+      </w:r>
+      <w:r>
+        <w:t>oad the package</w:t>
+      </w:r>
+      <w:r>
+        <w:t>,</w:t>
+      </w:r>
+      <w:r>
+        <w:t xml:space="preserve"> and run the pipeline</w:t>
+      </w:r>
+    </w:p>
+    <w:p>
+      <w:pPr>
+        <w:rPr>
+          <w:b/>
+          <w:bCs/>
+        </w:rPr>
+      </w:pPr>
+    </w:p>
+    <w:p>
+      <w:pPr>
+        <w:rPr>
+          <w:b/>
+          <w:bCs/>
+        </w:rPr>
+      </w:pPr>
+      <w:r>
+        <w:rPr>
+          <w:b/>
+          <w:bCs/>
+        </w:rPr>
+        <w:t>Run the following code in your R:</w:t>
+      </w:r>
+    </w:p>
+    <w:p>
       <w:r>
         <w:rPr>
           <w:rFonts w:ascii="Courier New" w:eastAsia="Courier New" w:hAnsi="Courier New"/>
           <w:sz w:val="19"/>
         </w:rPr>
-        <w:t>getwd</w:t>
-      </w:r>
-      <w:proofErr w:type="spellEnd"/>
+        <w:t>install.packages(</w:t>
+      </w:r>
       <w:r>
         <w:rPr>
           <w:rFonts w:ascii="Courier New" w:eastAsia="Courier New" w:hAnsi="Courier New"/>
           <w:sz w:val="19"/>
         </w:rPr>
-        <w:t>(</w:t>
-      </w:r>
-      <w:proofErr w:type="gramEnd"/>
+        <w:t>"</w:t>
+      </w:r>
+      <w:r>
+        <w:rPr>
+          <w:rFonts w:ascii="Courier New" w:eastAsia="Courier New" w:hAnsi="Courier New"/>
+          <w:sz w:val="19"/>
+        </w:rPr>
+        <w:t>devtools</w:t>
+      </w:r>
+      <w:r>
+        <w:rPr>
+          <w:rFonts w:ascii="Courier New" w:eastAsia="Courier New" w:hAnsi="Courier New"/>
+          <w:sz w:val="19"/>
+        </w:rPr>
+        <w:t>"</w:t>
+      </w:r>
       <w:r>
         <w:rPr>
           <w:rFonts w:ascii="Courier New" w:eastAsia="Courier New" w:hAnsi="Courier New"/>
@@ -565,66 +531,12 @@
       </w:r>
     </w:p>
     <w:p>
-      <w:pPr>
-        <w:pStyle w:val="Heading1"/>
-      </w:pPr>
-      <w:r>
-        <w:t xml:space="preserve">6. </w:t>
-      </w:r>
-      <w:r>
-        <w:t>Install, l</w:t>
-      </w:r>
-      <w:r>
-        <w:t>oad the package</w:t>
-      </w:r>
-      <w:r>
-        <w:t>,</w:t>
-      </w:r>
-      <w:r>
-        <w:t xml:space="preserve"> and run the pipeline</w:t>
-      </w:r>
-    </w:p>
-    <w:p>
-      <w:pPr>
-        <w:rPr>
-          <w:b/>
-          <w:bCs/>
-        </w:rPr>
-      </w:pPr>
-    </w:p>
-    <w:p>
-      <w:pPr>
-        <w:rPr>
-          <w:b/>
-          <w:bCs/>
-        </w:rPr>
-      </w:pPr>
-      <w:r>
-        <w:rPr>
-          <w:b/>
-          <w:bCs/>
-        </w:rPr>
-        <w:t>Run the following code in your R:</w:t>
-      </w:r>
-    </w:p>
-    <w:p>
-      <w:proofErr w:type="spellStart"/>
-      <w:proofErr w:type="gramStart"/>
       <w:r>
         <w:rPr>
           <w:rFonts w:ascii="Courier New" w:eastAsia="Courier New" w:hAnsi="Courier New"/>
           <w:sz w:val="19"/>
         </w:rPr>
-        <w:t>install.packages</w:t>
-      </w:r>
-      <w:proofErr w:type="spellEnd"/>
-      <w:proofErr w:type="gramEnd"/>
-      <w:r>
-        <w:rPr>
-          <w:rFonts w:ascii="Courier New" w:eastAsia="Courier New" w:hAnsi="Courier New"/>
-          <w:sz w:val="19"/>
-        </w:rPr>
-        <w:t>(</w:t>
+        <w:t>devtools::install_github(</w:t>
       </w:r>
       <w:r>
         <w:rPr>
@@ -633,15 +545,13 @@
         </w:rPr>
         <w:t>"</w:t>
       </w:r>
-      <w:proofErr w:type="spellStart"/>
       <w:r>
         <w:rPr>
           <w:rFonts w:ascii="Courier New" w:eastAsia="Courier New" w:hAnsi="Courier New"/>
           <w:sz w:val="19"/>
         </w:rPr>
-        <w:t>devtools</w:t>
-      </w:r>
-      <w:proofErr w:type="spellEnd"/>
+        <w:t>JohnLongPhD/chewR</w:t>
+      </w:r>
       <w:r>
         <w:rPr>
           <w:rFonts w:ascii="Courier New" w:eastAsia="Courier New" w:hAnsi="Courier New"/>
@@ -657,100 +567,10 @@
         <w:t>)</w:t>
       </w:r>
     </w:p>
-    <w:p>
-      <w:proofErr w:type="spellStart"/>
-      <w:proofErr w:type="gramStart"/>
-      <w:r>
-        <w:rPr>
-          <w:rFonts w:ascii="Courier New" w:eastAsia="Courier New" w:hAnsi="Courier New"/>
-          <w:sz w:val="19"/>
-        </w:rPr>
-        <w:t>devtools</w:t>
-      </w:r>
-      <w:proofErr w:type="spellEnd"/>
-      <w:r>
-        <w:rPr>
-          <w:rFonts w:ascii="Courier New" w:eastAsia="Courier New" w:hAnsi="Courier New"/>
-          <w:sz w:val="19"/>
-        </w:rPr>
-        <w:t>::</w:t>
-      </w:r>
-      <w:proofErr w:type="spellStart"/>
-      <w:proofErr w:type="gramEnd"/>
-      <w:r>
-        <w:rPr>
-          <w:rFonts w:ascii="Courier New" w:eastAsia="Courier New" w:hAnsi="Courier New"/>
-          <w:sz w:val="19"/>
-        </w:rPr>
-        <w:t>install_github</w:t>
-      </w:r>
-      <w:proofErr w:type="spellEnd"/>
-      <w:r>
-        <w:rPr>
-          <w:rFonts w:ascii="Courier New" w:eastAsia="Courier New" w:hAnsi="Courier New"/>
-          <w:sz w:val="19"/>
-        </w:rPr>
-        <w:t>(</w:t>
-      </w:r>
-      <w:r>
-        <w:rPr>
-          <w:rFonts w:ascii="Courier New" w:eastAsia="Courier New" w:hAnsi="Courier New"/>
-          <w:sz w:val="19"/>
-        </w:rPr>
-        <w:t>"</w:t>
-      </w:r>
-      <w:proofErr w:type="spellStart"/>
-      <w:r>
-        <w:rPr>
-          <w:rFonts w:ascii="Courier New" w:eastAsia="Courier New" w:hAnsi="Courier New"/>
-          <w:sz w:val="19"/>
-        </w:rPr>
-        <w:t>JohnLongPhD</w:t>
-      </w:r>
-      <w:proofErr w:type="spellEnd"/>
-      <w:r>
-        <w:rPr>
-          <w:rFonts w:ascii="Courier New" w:eastAsia="Courier New" w:hAnsi="Courier New"/>
-          <w:sz w:val="19"/>
-        </w:rPr>
-        <w:t>/</w:t>
-      </w:r>
-      <w:proofErr w:type="spellStart"/>
-      <w:r>
-        <w:rPr>
-          <w:rFonts w:ascii="Courier New" w:eastAsia="Courier New" w:hAnsi="Courier New"/>
-          <w:sz w:val="19"/>
-        </w:rPr>
-        <w:t>chewR</w:t>
-      </w:r>
-      <w:proofErr w:type="spellEnd"/>
-      <w:r>
-        <w:rPr>
-          <w:rFonts w:ascii="Courier New" w:eastAsia="Courier New" w:hAnsi="Courier New"/>
-          <w:sz w:val="19"/>
-        </w:rPr>
-        <w:t>"</w:t>
-      </w:r>
-      <w:r>
-        <w:rPr>
-          <w:rFonts w:ascii="Courier New" w:eastAsia="Courier New" w:hAnsi="Courier New"/>
-          <w:sz w:val="19"/>
-        </w:rPr>
-        <w:t>)</w:t>
-      </w:r>
-    </w:p>
     <w:p/>
     <w:p>
       <w:r>
-        <w:t xml:space="preserve">If </w:t>
-      </w:r>
-      <w:proofErr w:type="spellStart"/>
-      <w:r>
-        <w:t>devtools</w:t>
-      </w:r>
-      <w:proofErr w:type="spellEnd"/>
-      <w:r>
-        <w:t xml:space="preserve"> does not install</w:t>
+        <w:t>If devtools does not install</w:t>
       </w:r>
       <w:r>
         <w:t xml:space="preserve"> from the code above</w:t>
@@ -830,17 +650,79 @@
           <w:rFonts w:ascii="Courier New" w:eastAsia="Courier New" w:hAnsi="Courier New"/>
           <w:sz w:val="19"/>
         </w:rPr>
-        <w:t>library(</w:t>
-      </w:r>
-      <w:proofErr w:type="spellStart"/>
+        <w:t>library(chewR)</w:t>
+      </w:r>
+    </w:p>
+    <w:p>
       <w:r>
         <w:rPr>
           <w:rFonts w:ascii="Courier New" w:eastAsia="Courier New" w:hAnsi="Courier New"/>
           <w:sz w:val="19"/>
         </w:rPr>
-        <w:t>chewR</w:t>
-      </w:r>
-      <w:proofErr w:type="spellEnd"/>
+        <w:t>#set your working directory to the folder that contains the images</w:t>
+      </w:r>
+    </w:p>
+    <w:p>
+      <w:r>
+        <w:rPr>
+          <w:rFonts w:ascii="Courier New" w:eastAsia="Courier New" w:hAnsi="Courier New"/>
+          <w:sz w:val="19"/>
+        </w:rPr>
+        <w:t>pipeline_results &lt;- run_chewr_pipeline(</w:t>
+      </w:r>
+    </w:p>
+    <w:p>
+      <w:r>
+        <w:rPr>
+          <w:rFonts w:ascii="Courier New" w:eastAsia="Courier New" w:hAnsi="Courier New"/>
+          <w:sz w:val="19"/>
+        </w:rPr>
+        <w:t xml:space="preserve">  protocol             = "chew",</w:t>
+      </w:r>
+    </w:p>
+    <w:p>
+      <w:r>
+        <w:rPr>
+          <w:rFonts w:ascii="Courier New" w:eastAsia="Courier New" w:hAnsi="Courier New"/>
+          <w:sz w:val="19"/>
+        </w:rPr>
+        <w:t xml:space="preserve">  output_excel_path    = "chewR_results.xlsx",</w:t>
+      </w:r>
+    </w:p>
+    <w:p>
+      <w:r>
+        <w:rPr>
+          <w:rFonts w:ascii="Courier New" w:eastAsia="Courier New" w:hAnsi="Courier New"/>
+          <w:sz w:val="19"/>
+        </w:rPr>
+        <w:t xml:space="preserve">  output_plot_dir      = "chewR_plots",</w:t>
+      </w:r>
+    </w:p>
+    <w:p>
+      <w:r>
+        <w:rPr>
+          <w:rFonts w:ascii="Courier New" w:eastAsia="Courier New" w:hAnsi="Courier New"/>
+          <w:sz w:val="19"/>
+        </w:rPr>
+        <w:t xml:space="preserve">  auto_crop            = TRUE,</w:t>
+      </w:r>
+    </w:p>
+    <w:p>
+      <w:r>
+        <w:rPr>
+          <w:rFonts w:ascii="Courier New" w:eastAsia="Courier New" w:hAnsi="Courier New"/>
+          <w:sz w:val="19"/>
+        </w:rPr>
+        <w:t xml:space="preserve">  save_analysis_images = TRUE</w:t>
+      </w:r>
+    </w:p>
+    <w:p>
+      <w:pPr>
+        <w:rPr>
+          <w:rFonts w:ascii="Courier New" w:eastAsia="Courier New" w:hAnsi="Courier New"/>
+          <w:sz w:val="19"/>
+        </w:rPr>
+      </w:pPr>
       <w:r>
         <w:rPr>
           <w:rFonts w:ascii="Courier New" w:eastAsia="Courier New" w:hAnsi="Courier New"/>
@@ -855,67 +737,81 @@
           <w:rFonts w:ascii="Courier New" w:eastAsia="Courier New" w:hAnsi="Courier New"/>
           <w:sz w:val="19"/>
         </w:rPr>
-        <w:t>#</w:t>
-      </w:r>
-      <w:proofErr w:type="gramStart"/>
+        <w:t xml:space="preserve">#see the excel file in your working directory for the </w:t>
+      </w:r>
       <w:r>
         <w:rPr>
           <w:rFonts w:ascii="Courier New" w:eastAsia="Courier New" w:hAnsi="Courier New"/>
           <w:sz w:val="19"/>
         </w:rPr>
-        <w:t>set</w:t>
-      </w:r>
-      <w:proofErr w:type="gramEnd"/>
+        <w:t>masticatory performance</w:t>
+      </w:r>
       <w:r>
         <w:rPr>
           <w:rFonts w:ascii="Courier New" w:eastAsia="Courier New" w:hAnsi="Courier New"/>
           <w:sz w:val="19"/>
         </w:rPr>
-        <w:t xml:space="preserve"> your working directory to the folder that contains the images</w:t>
+        <w:t xml:space="preserve"> variables</w:t>
+      </w:r>
+    </w:p>
+    <w:p/>
+    <w:p/>
+    <w:p>
+      <w:pPr>
+        <w:rPr>
+          <w:b/>
+          <w:bCs/>
+        </w:rPr>
+      </w:pPr>
+      <w:r>
+        <w:rPr>
+          <w:b/>
+          <w:bCs/>
+        </w:rPr>
+        <w:t>If your filenames use the fixed format:</w:t>
       </w:r>
     </w:p>
     <w:p>
-      <w:proofErr w:type="spellStart"/>
-      <w:r>
+      <w:pPr>
         <w:rPr>
           <w:rFonts w:ascii="Courier New" w:eastAsia="Courier New" w:hAnsi="Courier New"/>
           <w:sz w:val="19"/>
         </w:rPr>
-        <w:t>pipeline_results</w:t>
-      </w:r>
-      <w:proofErr w:type="spellEnd"/>
+      </w:pPr>
       <w:r>
         <w:rPr>
           <w:rFonts w:ascii="Courier New" w:eastAsia="Courier New" w:hAnsi="Courier New"/>
           <w:sz w:val="19"/>
         </w:rPr>
-        <w:t xml:space="preserve"> &lt;- </w:t>
-      </w:r>
-      <w:proofErr w:type="spellStart"/>
+        <w:t>library(chewR)</w:t>
+      </w:r>
+    </w:p>
+    <w:p>
       <w:r>
         <w:rPr>
           <w:rFonts w:ascii="Courier New" w:eastAsia="Courier New" w:hAnsi="Courier New"/>
           <w:sz w:val="19"/>
         </w:rPr>
-        <w:t>run_chewr_</w:t>
-      </w:r>
-      <w:proofErr w:type="gramStart"/>
+        <w:t>#set your working directory to the folder that contains the images</w:t>
+      </w:r>
+    </w:p>
+    <w:p>
       <w:r>
         <w:rPr>
           <w:rFonts w:ascii="Courier New" w:eastAsia="Courier New" w:hAnsi="Courier New"/>
           <w:sz w:val="19"/>
         </w:rPr>
-        <w:t>pipeline</w:t>
-      </w:r>
-      <w:proofErr w:type="spellEnd"/>
+        <w:t>pipeline_results &lt;- run_chewr_pipeline(</w:t>
+      </w:r>
+    </w:p>
+    <w:p>
       <w:r>
         <w:rPr>
           <w:rFonts w:ascii="Courier New" w:eastAsia="Courier New" w:hAnsi="Courier New"/>
           <w:sz w:val="19"/>
         </w:rPr>
-        <w:t>(</w:t>
-      </w:r>
-      <w:proofErr w:type="gramEnd"/>
+        <w:t xml:space="preserve">  protocol             = "fixed",</w:t>
+      </w:r>
     </w:p>
     <w:p>
       <w:r>
@@ -923,7 +819,7 @@
           <w:rFonts w:ascii="Courier New" w:eastAsia="Courier New" w:hAnsi="Courier New"/>
           <w:sz w:val="19"/>
         </w:rPr>
-        <w:t xml:space="preserve">  protocol             = "chew",</w:t>
+        <w:t xml:space="preserve">  output_excel_path    = "chewR_results.xlsx",</w:t>
       </w:r>
     </w:p>
     <w:p>
@@ -932,114 +828,25 @@
           <w:rFonts w:ascii="Courier New" w:eastAsia="Courier New" w:hAnsi="Courier New"/>
           <w:sz w:val="19"/>
         </w:rPr>
-        <w:t xml:space="preserve">  </w:t>
-      </w:r>
-      <w:proofErr w:type="spellStart"/>
+        <w:t xml:space="preserve">  output_plot_dir      = "chewR_plots",</w:t>
+      </w:r>
+    </w:p>
+    <w:p>
       <w:r>
         <w:rPr>
           <w:rFonts w:ascii="Courier New" w:eastAsia="Courier New" w:hAnsi="Courier New"/>
           <w:sz w:val="19"/>
         </w:rPr>
-        <w:t>output_excel_path</w:t>
-      </w:r>
-      <w:proofErr w:type="spellEnd"/>
+        <w:t xml:space="preserve">  auto_crop            = TRUE,</w:t>
+      </w:r>
+    </w:p>
+    <w:p>
       <w:r>
         <w:rPr>
           <w:rFonts w:ascii="Courier New" w:eastAsia="Courier New" w:hAnsi="Courier New"/>
           <w:sz w:val="19"/>
         </w:rPr>
-        <w:t xml:space="preserve">    = "chewR_results.xlsx",</w:t>
-      </w:r>
-    </w:p>
-    <w:p>
-      <w:r>
-        <w:rPr>
-          <w:rFonts w:ascii="Courier New" w:eastAsia="Courier New" w:hAnsi="Courier New"/>
-          <w:sz w:val="19"/>
-        </w:rPr>
-        <w:t xml:space="preserve">  </w:t>
-      </w:r>
-      <w:proofErr w:type="spellStart"/>
-      <w:r>
-        <w:rPr>
-          <w:rFonts w:ascii="Courier New" w:eastAsia="Courier New" w:hAnsi="Courier New"/>
-          <w:sz w:val="19"/>
-        </w:rPr>
-        <w:t>output_plot_dir</w:t>
-      </w:r>
-      <w:proofErr w:type="spellEnd"/>
-      <w:r>
-        <w:rPr>
-          <w:rFonts w:ascii="Courier New" w:eastAsia="Courier New" w:hAnsi="Courier New"/>
-          <w:sz w:val="19"/>
-        </w:rPr>
-        <w:t xml:space="preserve">      = "</w:t>
-      </w:r>
-      <w:proofErr w:type="spellStart"/>
-      <w:r>
-        <w:rPr>
-          <w:rFonts w:ascii="Courier New" w:eastAsia="Courier New" w:hAnsi="Courier New"/>
-          <w:sz w:val="19"/>
-        </w:rPr>
-        <w:t>chewR_plots</w:t>
-      </w:r>
-      <w:proofErr w:type="spellEnd"/>
-      <w:r>
-        <w:rPr>
-          <w:rFonts w:ascii="Courier New" w:eastAsia="Courier New" w:hAnsi="Courier New"/>
-          <w:sz w:val="19"/>
-        </w:rPr>
-        <w:t>",</w:t>
-      </w:r>
-    </w:p>
-    <w:p>
-      <w:r>
-        <w:rPr>
-          <w:rFonts w:ascii="Courier New" w:eastAsia="Courier New" w:hAnsi="Courier New"/>
-          <w:sz w:val="19"/>
-        </w:rPr>
-        <w:t xml:space="preserve">  </w:t>
-      </w:r>
-      <w:proofErr w:type="spellStart"/>
-      <w:r>
-        <w:rPr>
-          <w:rFonts w:ascii="Courier New" w:eastAsia="Courier New" w:hAnsi="Courier New"/>
-          <w:sz w:val="19"/>
-        </w:rPr>
-        <w:t>auto_crop</w:t>
-      </w:r>
-      <w:proofErr w:type="spellEnd"/>
-      <w:r>
-        <w:rPr>
-          <w:rFonts w:ascii="Courier New" w:eastAsia="Courier New" w:hAnsi="Courier New"/>
-          <w:sz w:val="19"/>
-        </w:rPr>
-        <w:t xml:space="preserve">            = TRUE,</w:t>
-      </w:r>
-    </w:p>
-    <w:p>
-      <w:r>
-        <w:rPr>
-          <w:rFonts w:ascii="Courier New" w:eastAsia="Courier New" w:hAnsi="Courier New"/>
-          <w:sz w:val="19"/>
-        </w:rPr>
-        <w:t xml:space="preserve">  </w:t>
-      </w:r>
-      <w:proofErr w:type="spellStart"/>
-      <w:r>
-        <w:rPr>
-          <w:rFonts w:ascii="Courier New" w:eastAsia="Courier New" w:hAnsi="Courier New"/>
-          <w:sz w:val="19"/>
-        </w:rPr>
-        <w:t>save_analysis_images</w:t>
-      </w:r>
-      <w:proofErr w:type="spellEnd"/>
-      <w:r>
-        <w:rPr>
-          <w:rFonts w:ascii="Courier New" w:eastAsia="Courier New" w:hAnsi="Courier New"/>
-          <w:sz w:val="19"/>
-        </w:rPr>
-        <w:t xml:space="preserve"> = TRUE</w:t>
+        <w:t xml:space="preserve">  save_analysis_images = TRUE</w:t>
       </w:r>
     </w:p>
     <w:p>
@@ -1063,40 +870,21 @@
           <w:rFonts w:ascii="Courier New" w:eastAsia="Courier New" w:hAnsi="Courier New"/>
           <w:sz w:val="19"/>
         </w:rPr>
-        <w:t>#</w:t>
-      </w:r>
-      <w:proofErr w:type="gramStart"/>
+        <w:t xml:space="preserve">#see the excel file in your working directory for the </w:t>
+      </w:r>
       <w:r>
         <w:rPr>
           <w:rFonts w:ascii="Courier New" w:eastAsia="Courier New" w:hAnsi="Courier New"/>
           <w:sz w:val="19"/>
         </w:rPr>
-        <w:t>see</w:t>
-      </w:r>
-      <w:proofErr w:type="gramEnd"/>
+        <w:t>masticatory performance</w:t>
+      </w:r>
       <w:r>
         <w:rPr>
           <w:rFonts w:ascii="Courier New" w:eastAsia="Courier New" w:hAnsi="Courier New"/>
           <w:sz w:val="19"/>
         </w:rPr>
-        <w:t xml:space="preserve"> the excel file in your working directory for the chewing efficiency variables</w:t>
-      </w:r>
-    </w:p>
-    <w:p/>
-    <w:p/>
-    <w:p>
-      <w:pPr>
-        <w:rPr>
-          <w:b/>
-          <w:bCs/>
-        </w:rPr>
-      </w:pPr>
-      <w:r>
-        <w:rPr>
-          <w:b/>
-          <w:bCs/>
-        </w:rPr>
-        <w:t>If your filenames use the fixed format:</w:t>
+        <w:t xml:space="preserve"> variables</w:t>
       </w:r>
     </w:p>
     <w:p>
@@ -1106,337 +894,65 @@
           <w:sz w:val="19"/>
         </w:rPr>
       </w:pPr>
-      <w:r>
+    </w:p>
+    <w:p>
+      <w:pPr>
         <w:rPr>
           <w:rFonts w:ascii="Courier New" w:eastAsia="Courier New" w:hAnsi="Courier New"/>
           <w:sz w:val="19"/>
         </w:rPr>
-        <w:t>library(</w:t>
-      </w:r>
-      <w:proofErr w:type="spellStart"/>
-      <w:r>
+      </w:pPr>
+    </w:p>
+    <w:p>
+      <w:pPr>
         <w:rPr>
           <w:rFonts w:ascii="Courier New" w:eastAsia="Courier New" w:hAnsi="Courier New"/>
           <w:sz w:val="19"/>
         </w:rPr>
-        <w:t>chewR</w:t>
-      </w:r>
-      <w:proofErr w:type="spellEnd"/>
-      <w:r>
+      </w:pPr>
+    </w:p>
+    <w:p>
+      <w:pPr>
         <w:rPr>
           <w:rFonts w:ascii="Courier New" w:eastAsia="Courier New" w:hAnsi="Courier New"/>
           <w:sz w:val="19"/>
         </w:rPr>
-        <w:t>)</w:t>
-      </w:r>
+      </w:pPr>
     </w:p>
     <w:p>
-      <w:r>
+      <w:pPr>
         <w:rPr>
           <w:rFonts w:ascii="Courier New" w:eastAsia="Courier New" w:hAnsi="Courier New"/>
           <w:sz w:val="19"/>
         </w:rPr>
-        <w:t>#</w:t>
-      </w:r>
-      <w:proofErr w:type="gramStart"/>
-      <w:r>
+      </w:pPr>
+    </w:p>
+    <w:p>
+      <w:pPr>
         <w:rPr>
           <w:rFonts w:ascii="Courier New" w:eastAsia="Courier New" w:hAnsi="Courier New"/>
           <w:sz w:val="19"/>
         </w:rPr>
-        <w:t>set</w:t>
-      </w:r>
-      <w:proofErr w:type="gramEnd"/>
-      <w:r>
+      </w:pPr>
+    </w:p>
+    <w:p>
+      <w:pPr>
         <w:rPr>
           <w:rFonts w:ascii="Courier New" w:eastAsia="Courier New" w:hAnsi="Courier New"/>
           <w:sz w:val="19"/>
         </w:rPr>
-        <w:t xml:space="preserve"> your working directory to the folder that contains the images</w:t>
-      </w:r>
+      </w:pPr>
     </w:p>
     <w:p>
-      <w:proofErr w:type="spellStart"/>
-      <w:r>
-        <w:rPr>
-          <w:rFonts w:ascii="Courier New" w:eastAsia="Courier New" w:hAnsi="Courier New"/>
-          <w:sz w:val="19"/>
-        </w:rPr>
-        <w:t>pipeline_results</w:t>
-      </w:r>
-      <w:proofErr w:type="spellEnd"/>
-      <w:r>
-        <w:rPr>
-          <w:rFonts w:ascii="Courier New" w:eastAsia="Courier New" w:hAnsi="Courier New"/>
-          <w:sz w:val="19"/>
-        </w:rPr>
-        <w:t xml:space="preserve"> &lt;- </w:t>
-      </w:r>
-      <w:proofErr w:type="spellStart"/>
-      <w:r>
-        <w:rPr>
-          <w:rFonts w:ascii="Courier New" w:eastAsia="Courier New" w:hAnsi="Courier New"/>
-          <w:sz w:val="19"/>
-        </w:rPr>
-        <w:t>run_chewr_</w:t>
-      </w:r>
-      <w:proofErr w:type="gramStart"/>
-      <w:r>
-        <w:rPr>
-          <w:rFonts w:ascii="Courier New" w:eastAsia="Courier New" w:hAnsi="Courier New"/>
-          <w:sz w:val="19"/>
-        </w:rPr>
-        <w:t>pipeline</w:t>
-      </w:r>
-      <w:proofErr w:type="spellEnd"/>
-      <w:r>
-        <w:rPr>
-          <w:rFonts w:ascii="Courier New" w:eastAsia="Courier New" w:hAnsi="Courier New"/>
-          <w:sz w:val="19"/>
-        </w:rPr>
-        <w:t>(</w:t>
-      </w:r>
-      <w:proofErr w:type="gramEnd"/>
-    </w:p>
-    <w:p>
-      <w:r>
-        <w:rPr>
-          <w:rFonts w:ascii="Courier New" w:eastAsia="Courier New" w:hAnsi="Courier New"/>
-          <w:sz w:val="19"/>
-        </w:rPr>
-        <w:t xml:space="preserve">  protocol             = "fixed",</w:t>
-      </w:r>
-    </w:p>
-    <w:p>
-      <w:r>
-        <w:rPr>
-          <w:rFonts w:ascii="Courier New" w:eastAsia="Courier New" w:hAnsi="Courier New"/>
-          <w:sz w:val="19"/>
-        </w:rPr>
-        <w:t xml:space="preserve">  </w:t>
-      </w:r>
-      <w:proofErr w:type="spellStart"/>
-      <w:r>
-        <w:rPr>
-          <w:rFonts w:ascii="Courier New" w:eastAsia="Courier New" w:hAnsi="Courier New"/>
-          <w:sz w:val="19"/>
-        </w:rPr>
-        <w:t>output_excel_path</w:t>
-      </w:r>
-      <w:proofErr w:type="spellEnd"/>
-      <w:r>
-        <w:rPr>
-          <w:rFonts w:ascii="Courier New" w:eastAsia="Courier New" w:hAnsi="Courier New"/>
-          <w:sz w:val="19"/>
-        </w:rPr>
-        <w:t xml:space="preserve">    = "chewR_results.xlsx",</w:t>
-      </w:r>
-    </w:p>
-    <w:p>
-      <w:r>
-        <w:rPr>
-          <w:rFonts w:ascii="Courier New" w:eastAsia="Courier New" w:hAnsi="Courier New"/>
-          <w:sz w:val="19"/>
-        </w:rPr>
-        <w:t xml:space="preserve">  </w:t>
-      </w:r>
-      <w:proofErr w:type="spellStart"/>
-      <w:r>
-        <w:rPr>
-          <w:rFonts w:ascii="Courier New" w:eastAsia="Courier New" w:hAnsi="Courier New"/>
-          <w:sz w:val="19"/>
-        </w:rPr>
-        <w:t>output_plot_dir</w:t>
-      </w:r>
-      <w:proofErr w:type="spellEnd"/>
-      <w:r>
-        <w:rPr>
-          <w:rFonts w:ascii="Courier New" w:eastAsia="Courier New" w:hAnsi="Courier New"/>
-          <w:sz w:val="19"/>
-        </w:rPr>
-        <w:t xml:space="preserve">      = "</w:t>
-      </w:r>
-      <w:proofErr w:type="spellStart"/>
-      <w:r>
-        <w:rPr>
-          <w:rFonts w:ascii="Courier New" w:eastAsia="Courier New" w:hAnsi="Courier New"/>
-          <w:sz w:val="19"/>
-        </w:rPr>
-        <w:t>chewR_plots</w:t>
-      </w:r>
-      <w:proofErr w:type="spellEnd"/>
-      <w:r>
-        <w:rPr>
-          <w:rFonts w:ascii="Courier New" w:eastAsia="Courier New" w:hAnsi="Courier New"/>
-          <w:sz w:val="19"/>
-        </w:rPr>
-        <w:t>",</w:t>
-      </w:r>
-    </w:p>
-    <w:p>
-      <w:r>
-        <w:rPr>
-          <w:rFonts w:ascii="Courier New" w:eastAsia="Courier New" w:hAnsi="Courier New"/>
-          <w:sz w:val="19"/>
-        </w:rPr>
-        <w:t xml:space="preserve">  </w:t>
-      </w:r>
-      <w:proofErr w:type="spellStart"/>
-      <w:r>
-        <w:rPr>
-          <w:rFonts w:ascii="Courier New" w:eastAsia="Courier New" w:hAnsi="Courier New"/>
-          <w:sz w:val="19"/>
-        </w:rPr>
-        <w:t>auto_crop</w:t>
-      </w:r>
-      <w:proofErr w:type="spellEnd"/>
-      <w:r>
-        <w:rPr>
-          <w:rFonts w:ascii="Courier New" w:eastAsia="Courier New" w:hAnsi="Courier New"/>
-          <w:sz w:val="19"/>
-        </w:rPr>
-        <w:t xml:space="preserve">            = TRUE,</w:t>
-      </w:r>
-    </w:p>
-    <w:p>
-      <w:r>
-        <w:rPr>
-          <w:rFonts w:ascii="Courier New" w:eastAsia="Courier New" w:hAnsi="Courier New"/>
-          <w:sz w:val="19"/>
-        </w:rPr>
-        <w:t xml:space="preserve">  </w:t>
-      </w:r>
-      <w:proofErr w:type="spellStart"/>
-      <w:r>
-        <w:rPr>
-          <w:rFonts w:ascii="Courier New" w:eastAsia="Courier New" w:hAnsi="Courier New"/>
-          <w:sz w:val="19"/>
-        </w:rPr>
-        <w:t>save_analysis_images</w:t>
-      </w:r>
-      <w:proofErr w:type="spellEnd"/>
-      <w:r>
-        <w:rPr>
-          <w:rFonts w:ascii="Courier New" w:eastAsia="Courier New" w:hAnsi="Courier New"/>
-          <w:sz w:val="19"/>
-        </w:rPr>
-        <w:t xml:space="preserve"> = TRUE</w:t>
-      </w:r>
-    </w:p>
-    <w:p>
-      <w:pPr>
-        <w:rPr>
-          <w:rFonts w:ascii="Courier New" w:eastAsia="Courier New" w:hAnsi="Courier New"/>
-          <w:sz w:val="19"/>
-        </w:rPr>
-      </w:pPr>
-      <w:r>
-        <w:rPr>
-          <w:rFonts w:ascii="Courier New" w:eastAsia="Courier New" w:hAnsi="Courier New"/>
-          <w:sz w:val="19"/>
-        </w:rPr>
-        <w:t>)</w:t>
-      </w:r>
-    </w:p>
-    <w:p>
-      <w:r>
-        <w:rPr>
-          <w:rFonts w:ascii="Courier New" w:eastAsia="Courier New" w:hAnsi="Courier New"/>
-          <w:sz w:val="19"/>
-        </w:rPr>
-        <w:t>#</w:t>
-      </w:r>
-      <w:proofErr w:type="gramStart"/>
-      <w:r>
-        <w:rPr>
-          <w:rFonts w:ascii="Courier New" w:eastAsia="Courier New" w:hAnsi="Courier New"/>
-          <w:sz w:val="19"/>
-        </w:rPr>
-        <w:t>see</w:t>
-      </w:r>
-      <w:proofErr w:type="gramEnd"/>
-      <w:r>
-        <w:rPr>
-          <w:rFonts w:ascii="Courier New" w:eastAsia="Courier New" w:hAnsi="Courier New"/>
-          <w:sz w:val="19"/>
-        </w:rPr>
-        <w:t xml:space="preserve"> the excel file in your working directory for the chewing efficiency variables</w:t>
-      </w:r>
-    </w:p>
-    <w:p>
-      <w:pPr>
-        <w:rPr>
-          <w:rFonts w:ascii="Courier New" w:eastAsia="Courier New" w:hAnsi="Courier New"/>
-          <w:sz w:val="19"/>
-        </w:rPr>
-      </w:pPr>
-    </w:p>
-    <w:p>
-      <w:pPr>
-        <w:rPr>
-          <w:rFonts w:ascii="Courier New" w:eastAsia="Courier New" w:hAnsi="Courier New"/>
-          <w:sz w:val="19"/>
-        </w:rPr>
-      </w:pPr>
-    </w:p>
-    <w:p>
-      <w:pPr>
-        <w:rPr>
-          <w:rFonts w:ascii="Courier New" w:eastAsia="Courier New" w:hAnsi="Courier New"/>
-          <w:sz w:val="19"/>
-        </w:rPr>
-      </w:pPr>
-    </w:p>
-    <w:p>
-      <w:pPr>
-        <w:rPr>
-          <w:rFonts w:ascii="Courier New" w:eastAsia="Courier New" w:hAnsi="Courier New"/>
-          <w:sz w:val="19"/>
-        </w:rPr>
-      </w:pPr>
-    </w:p>
-    <w:p>
-      <w:pPr>
-        <w:rPr>
-          <w:rFonts w:ascii="Courier New" w:eastAsia="Courier New" w:hAnsi="Courier New"/>
-          <w:sz w:val="19"/>
-        </w:rPr>
-      </w:pPr>
-    </w:p>
-    <w:p>
-      <w:pPr>
-        <w:rPr>
-          <w:rFonts w:ascii="Courier New" w:eastAsia="Courier New" w:hAnsi="Courier New"/>
-          <w:sz w:val="19"/>
-        </w:rPr>
-      </w:pPr>
-    </w:p>
-    <w:p>
-      <w:pPr>
-        <w:rPr>
-          <w:rFonts w:ascii="Courier New" w:eastAsia="Courier New" w:hAnsi="Courier New"/>
-          <w:sz w:val="19"/>
-        </w:rPr>
-      </w:pPr>
-    </w:p>
-    <w:p>
       <w:r>
         <w:lastRenderedPageBreak/>
-        <w:t xml:space="preserve">In both formats, run the </w:t>
-      </w:r>
-      <w:proofErr w:type="spellStart"/>
-      <w:r>
-        <w:t>run_c</w:t>
+        <w:t>In both formats, run the run_c</w:t>
       </w:r>
       <w:r>
         <w:t>h</w:t>
       </w:r>
       <w:r>
-        <w:t>ewr_pipeline</w:t>
-      </w:r>
-      <w:proofErr w:type="spellEnd"/>
-      <w:r>
-        <w:t xml:space="preserve"> and these are the various modifications:</w:t>
+        <w:t>ewr_pipeline and these are the various modifications:</w:t>
       </w:r>
     </w:p>
     <w:p>
@@ -1483,21 +999,8 @@
           <w:numId w:val="10"/>
         </w:numPr>
       </w:pPr>
-      <w:proofErr w:type="spellStart"/>
-      <w:r>
-        <w:t>output_excel_path</w:t>
-      </w:r>
-      <w:proofErr w:type="spellEnd"/>
-      <w:r>
-        <w:t xml:space="preserve"> = the name of </w:t>
-      </w:r>
-      <w:proofErr w:type="gramStart"/>
-      <w:r>
-        <w:t>your</w:t>
-      </w:r>
-      <w:proofErr w:type="gramEnd"/>
-      <w:r>
-        <w:t xml:space="preserve"> excel spreadsheet that is generated once all your images have been analyzed</w:t>
+      <w:r>
+        <w:t>output_excel_path = the name of your excel spreadsheet that is generated once all your images have been analyzed</w:t>
       </w:r>
     </w:p>
     <w:p>
@@ -1508,13 +1011,8 @@
           <w:numId w:val="10"/>
         </w:numPr>
       </w:pPr>
-      <w:proofErr w:type="spellStart"/>
-      <w:r>
-        <w:t>output_plot_dir</w:t>
-      </w:r>
-      <w:proofErr w:type="spellEnd"/>
-      <w:r>
-        <w:t xml:space="preserve"> = the name of the folder that will contain the images used in the analysis </w:t>
+      <w:r>
+        <w:t xml:space="preserve">output_plot_dir = the name of the folder that will contain the images used in the analysis </w:t>
       </w:r>
     </w:p>
     <w:p>
@@ -1525,16 +1023,11 @@
           <w:numId w:val="10"/>
         </w:numPr>
       </w:pPr>
-      <w:proofErr w:type="spellStart"/>
       <w:r>
         <w:t>a</w:t>
       </w:r>
       <w:r>
-        <w:t>uto_crop</w:t>
-      </w:r>
-      <w:proofErr w:type="spellEnd"/>
-      <w:r>
-        <w:t xml:space="preserve"> = “TRUE” or “FALSE”</w:t>
+        <w:t>uto_crop = “TRUE” or “FALSE”</w:t>
       </w:r>
     </w:p>
     <w:p>
@@ -1569,13 +1062,8 @@
           <w:numId w:val="10"/>
         </w:numPr>
       </w:pPr>
-      <w:proofErr w:type="spellStart"/>
-      <w:r>
-        <w:t>save_analysis_images</w:t>
-      </w:r>
-      <w:proofErr w:type="spellEnd"/>
-      <w:r>
-        <w:t xml:space="preserve"> = “TRUE” or “FALSE”</w:t>
+      <w:r>
+        <w:t>save_analysis_images = “TRUE” or “FALSE”</w:t>
       </w:r>
     </w:p>
     <w:p>
@@ -1623,28 +1111,15 @@
         <w:pStyle w:val="ListBullet"/>
       </w:pPr>
       <w:r>
-        <w:t xml:space="preserve">An output folder, usually named </w:t>
-      </w:r>
-      <w:proofErr w:type="spellStart"/>
-      <w:r>
-        <w:t>chewR_plots</w:t>
-      </w:r>
-      <w:proofErr w:type="spellEnd"/>
+        <w:t>An output folder, usually named chewR_plots</w:t>
+      </w:r>
     </w:p>
     <w:p>
       <w:pPr>
         <w:pStyle w:val="ListBullet"/>
       </w:pPr>
       <w:r>
-        <w:t xml:space="preserve">A subfolder of cropped analysis images if </w:t>
-      </w:r>
-      <w:proofErr w:type="spellStart"/>
-      <w:r>
-        <w:t>save_analysis_images</w:t>
-      </w:r>
-      <w:proofErr w:type="spellEnd"/>
-      <w:r>
-        <w:t xml:space="preserve"> = TRUE</w:t>
+        <w:t>A subfolder of cropped analysis images if save_analysis_images = TRUE</w:t>
       </w:r>
     </w:p>
     <w:p>
@@ -1668,13 +1143,8 @@
           <w:numId w:val="14"/>
         </w:numPr>
       </w:pPr>
-      <w:proofErr w:type="spellStart"/>
-      <w:r>
-        <w:t>summary_sides_combined</w:t>
-      </w:r>
-      <w:proofErr w:type="spellEnd"/>
-      <w:r>
-        <w:t>: pooled result across both sides</w:t>
+      <w:r>
+        <w:t>summary_sides_combined: pooled result across both sides</w:t>
       </w:r>
     </w:p>
     <w:p>
@@ -1685,46 +1155,26 @@
           <w:numId w:val="13"/>
         </w:numPr>
       </w:pPr>
-      <w:proofErr w:type="spellStart"/>
-      <w:r>
-        <w:t>summary_by_side</w:t>
-      </w:r>
-      <w:proofErr w:type="spellEnd"/>
-      <w:r>
-        <w:t>: side-specific result</w:t>
+      <w:r>
+        <w:t>summary_by_side: side-specific result</w:t>
       </w:r>
     </w:p>
     <w:p>
       <w:r>
-        <w:t xml:space="preserve">Use the </w:t>
-      </w:r>
-      <w:proofErr w:type="spellStart"/>
-      <w:r>
-        <w:t>summary_sides_combined</w:t>
-      </w:r>
-      <w:proofErr w:type="spellEnd"/>
-      <w:r>
-        <w:t xml:space="preserve"> data for analyses.</w:t>
+        <w:t>Use the summary_sides_combined data for analyses.</w:t>
       </w:r>
     </w:p>
     <w:p/>
     <w:p>
       <w:r>
-        <w:t xml:space="preserve">You should also see score columns including </w:t>
-      </w:r>
-      <w:proofErr w:type="spellStart"/>
-      <w:r>
-        <w:t>chewr_raw_score</w:t>
-      </w:r>
-      <w:proofErr w:type="spellEnd"/>
-      <w:r>
-        <w:t xml:space="preserve"> and </w:t>
-      </w:r>
-      <w:proofErr w:type="spellStart"/>
-      <w:r>
-        <w:t>chewr_chewing_efficiency_score</w:t>
-      </w:r>
-      <w:proofErr w:type="spellEnd"/>
+        <w:t>You should also see score columns including chewr_raw_score and chewr_</w:t>
+      </w:r>
+      <w:r>
+        <w:t>masticatory_performance</w:t>
+      </w:r>
+      <w:r>
+        <w:t>_score</w:t>
+      </w:r>
     </w:p>
     <w:p>
       <w:pPr>
@@ -1734,13 +1184,8 @@
           <w:numId w:val="12"/>
         </w:numPr>
       </w:pPr>
-      <w:proofErr w:type="spellStart"/>
-      <w:r>
-        <w:t>chewr_raw_score</w:t>
-      </w:r>
-      <w:proofErr w:type="spellEnd"/>
-      <w:r>
-        <w:t xml:space="preserve"> is the </w:t>
+      <w:r>
+        <w:t xml:space="preserve">chewr_raw_score is the </w:t>
       </w:r>
       <w:r>
         <w:rPr>
@@ -1761,13 +1206,14 @@
           <w:numId w:val="12"/>
         </w:numPr>
       </w:pPr>
-      <w:proofErr w:type="spellStart"/>
-      <w:r>
-        <w:t>chewr_chewing_efficiency_score</w:t>
-      </w:r>
-      <w:proofErr w:type="spellEnd"/>
-      <w:r>
-        <w:t xml:space="preserve"> is the </w:t>
+      <w:r>
+        <w:t>chewr_masticatory_performance_score</w:t>
+      </w:r>
+      <w:r>
+        <w:t xml:space="preserve"> </w:t>
+      </w:r>
+      <w:r>
+        <w:t xml:space="preserve">is the </w:t>
       </w:r>
       <w:r>
         <w:rPr>
@@ -1816,13 +1262,8 @@
         <w:pStyle w:val="Heading1"/>
       </w:pPr>
       <w:r>
-        <w:t xml:space="preserve">9. How to cite </w:t>
-      </w:r>
-      <w:proofErr w:type="spellStart"/>
-      <w:r>
-        <w:t>chewR</w:t>
-      </w:r>
-      <w:proofErr w:type="spellEnd"/>
+        <w:t>9. How to cite chewR</w:t>
+      </w:r>
     </w:p>
     <w:p>
       <w:pPr>
@@ -1845,36 +1286,16 @@
           <w:b/>
           <w:bCs/>
         </w:rPr>
-        <w:t xml:space="preserve">If you use </w:t>
-      </w:r>
-      <w:proofErr w:type="spellStart"/>
-      <w:r>
-        <w:rPr>
-          <w:b/>
-          <w:bCs/>
-        </w:rPr>
-        <w:t>chewR</w:t>
-      </w:r>
-      <w:proofErr w:type="spellEnd"/>
-      <w:r>
-        <w:rPr>
-          <w:b/>
-          <w:bCs/>
-        </w:rPr>
-        <w:t xml:space="preserve"> in research, please cite:</w:t>
+        <w:t>If you use chewR in research, please cite:</w:t>
       </w:r>
     </w:p>
     <w:p>
       <w:r>
-        <w:t xml:space="preserve">Long JW (2026). </w:t>
-      </w:r>
-      <w:proofErr w:type="spellStart"/>
-      <w:r>
-        <w:t>chewR</w:t>
-      </w:r>
-      <w:proofErr w:type="spellEnd"/>
-      <w:r>
-        <w:t>: An Open-Source R Package for Quantifying Chewing Efficiency.</w:t>
+        <w:lastRenderedPageBreak/>
+        <w:t xml:space="preserve">Long JW (2026). chewR: An Open-Source R Package for Quantifying </w:t>
+      </w:r>
+      <w:r>
+        <w:t>Masticatory Performance</w:t>
       </w:r>
     </w:p>
     <w:p>
@@ -1887,7 +1308,6 @@
         <w:rPr>
           <w:lang w:val="de-DE"/>
         </w:rPr>
-        <w:lastRenderedPageBreak/>
         <w:t>R package version 0.0.1.</w:t>
       </w:r>
     </w:p>
@@ -1928,23 +1348,7 @@
           <w:rFonts w:ascii="Courier New" w:eastAsia="Courier New" w:hAnsi="Courier New"/>
           <w:sz w:val="19"/>
         </w:rPr>
-        <w:t>citation("</w:t>
-      </w:r>
-      <w:proofErr w:type="spellStart"/>
-      <w:r>
-        <w:rPr>
-          <w:rFonts w:ascii="Courier New" w:eastAsia="Courier New" w:hAnsi="Courier New"/>
-          <w:sz w:val="19"/>
-        </w:rPr>
-        <w:t>chewR</w:t>
-      </w:r>
-      <w:proofErr w:type="spellEnd"/>
-      <w:r>
-        <w:rPr>
-          <w:rFonts w:ascii="Courier New" w:eastAsia="Courier New" w:hAnsi="Courier New"/>
-          <w:sz w:val="19"/>
-        </w:rPr>
-        <w:t>")</w:t>
+        <w:t>citation("chewR")</w:t>
       </w:r>
     </w:p>
     <w:sectPr>

</xml_diff>